<commit_message>
BPMN kho , tuyen dung
</commit_message>
<xml_diff>
--- a/02_Quy_trinh/nga-quy-trinh-quan-ly-kho.docx
+++ b/02_Quy_trinh/nga-quy-trinh-quan-ly-kho.docx
@@ -1582,9 +1582,10 @@
         <w:tblLook w:val="04A0" w:firstRow="1" w:lastRow="0" w:firstColumn="1" w:lastColumn="0" w:noHBand="0" w:noVBand="1"/>
       </w:tblPr>
       <w:tblGrid>
-        <w:gridCol w:w="2860"/>
-        <w:gridCol w:w="5519"/>
-        <w:gridCol w:w="971"/>
+        <w:gridCol w:w="671"/>
+        <w:gridCol w:w="3491"/>
+        <w:gridCol w:w="1048"/>
+        <w:gridCol w:w="4140"/>
       </w:tblGrid>
       <w:tr>
         <w:tc>
@@ -1594,12 +1595,11 @@
           </w:tcPr>
           <w:p>
             <w:pPr>
-              <w:jc w:val="center"/>
+              <w:jc w:val="right"/>
               <w:rPr>
                 <w:rFonts w:ascii="Times New Roman" w:eastAsia="Times New Roman" w:hAnsi="Times New Roman" w:cs="Times New Roman"/>
                 <w:b/>
                 <w:bCs/>
-                <w:color w:val="000000" w:themeColor="text1"/>
                 <w:kern w:val="0"/>
                 <w14:ligatures w14:val="none"/>
               </w:rPr>
@@ -1609,11 +1609,10 @@
                 <w:rFonts w:ascii="Times New Roman" w:eastAsia="Times New Roman" w:hAnsi="Times New Roman" w:cs="Times New Roman"/>
                 <w:b/>
                 <w:bCs/>
-                <w:color w:val="000000" w:themeColor="text1"/>
                 <w:kern w:val="0"/>
                 <w14:ligatures w14:val="none"/>
               </w:rPr>
-              <w:t>Nhóm</w:t>
+              <w:t>STT</w:t>
             </w:r>
           </w:p>
         </w:tc>
@@ -1629,7 +1628,6 @@
                 <w:rFonts w:ascii="Times New Roman" w:eastAsia="Times New Roman" w:hAnsi="Times New Roman" w:cs="Times New Roman"/>
                 <w:b/>
                 <w:bCs/>
-                <w:color w:val="000000" w:themeColor="text1"/>
                 <w:kern w:val="0"/>
                 <w14:ligatures w14:val="none"/>
               </w:rPr>
@@ -1639,11 +1637,10 @@
                 <w:rFonts w:ascii="Times New Roman" w:eastAsia="Times New Roman" w:hAnsi="Times New Roman" w:cs="Times New Roman"/>
                 <w:b/>
                 <w:bCs/>
-                <w:color w:val="000000" w:themeColor="text1"/>
                 <w:kern w:val="0"/>
                 <w14:ligatures w14:val="none"/>
               </w:rPr>
-              <w:t>Hoạt động chính</w:t>
+              <w:t>Hoạt động</w:t>
             </w:r>
           </w:p>
         </w:tc>
@@ -1659,7 +1656,6 @@
                 <w:rFonts w:ascii="Times New Roman" w:eastAsia="Times New Roman" w:hAnsi="Times New Roman" w:cs="Times New Roman"/>
                 <w:b/>
                 <w:bCs/>
-                <w:color w:val="000000" w:themeColor="text1"/>
                 <w:kern w:val="0"/>
                 <w14:ligatures w14:val="none"/>
               </w:rPr>
@@ -1669,11 +1665,38 @@
                 <w:rFonts w:ascii="Times New Roman" w:eastAsia="Times New Roman" w:hAnsi="Times New Roman" w:cs="Times New Roman"/>
                 <w:b/>
                 <w:bCs/>
-                <w:color w:val="000000" w:themeColor="text1"/>
                 <w:kern w:val="0"/>
                 <w14:ligatures w14:val="none"/>
               </w:rPr>
-              <w:t>Thời gian</w:t>
+              <w:t>Phân loại</w:t>
+            </w:r>
+          </w:p>
+        </w:tc>
+        <w:tc>
+          <w:tcPr>
+            <w:tcW w:w="0" w:type="auto"/>
+            <w:hideMark/>
+          </w:tcPr>
+          <w:p>
+            <w:pPr>
+              <w:jc w:val="center"/>
+              <w:rPr>
+                <w:rFonts w:ascii="Times New Roman" w:eastAsia="Times New Roman" w:hAnsi="Times New Roman" w:cs="Times New Roman"/>
+                <w:b/>
+                <w:bCs/>
+                <w:kern w:val="0"/>
+                <w14:ligatures w14:val="none"/>
+              </w:rPr>
+            </w:pPr>
+            <w:r>
+              <w:rPr>
+                <w:rFonts w:ascii="Times New Roman" w:eastAsia="Times New Roman" w:hAnsi="Times New Roman" w:cs="Times New Roman"/>
+                <w:b/>
+                <w:bCs/>
+                <w:kern w:val="0"/>
+                <w14:ligatures w14:val="none"/>
+              </w:rPr>
+              <w:t>Nhận xét</w:t>
             </w:r>
           </w:p>
         </w:tc>
@@ -1686,9 +1709,9 @@
           </w:tcPr>
           <w:p>
             <w:pPr>
+              <w:jc w:val="right"/>
               <w:rPr>
                 <w:rFonts w:ascii="Times New Roman" w:eastAsia="Times New Roman" w:hAnsi="Times New Roman" w:cs="Times New Roman"/>
-                <w:color w:val="000000" w:themeColor="text1"/>
                 <w:kern w:val="0"/>
                 <w14:ligatures w14:val="none"/>
               </w:rPr>
@@ -1696,13 +1719,10 @@
             <w:r>
               <w:rPr>
                 <w:rFonts w:ascii="Times New Roman" w:eastAsia="Times New Roman" w:hAnsi="Times New Roman" w:cs="Times New Roman"/>
-                <w:b/>
-                <w:bCs/>
-                <w:color w:val="000000" w:themeColor="text1"/>
                 <w:kern w:val="0"/>
                 <w14:ligatures w14:val="none"/>
               </w:rPr>
-              <w:t>VA – Giá trị gia tăng</w:t>
+              <w:t>1</w:t>
             </w:r>
           </w:p>
         </w:tc>
@@ -1715,7 +1735,6 @@
             <w:pPr>
               <w:rPr>
                 <w:rFonts w:ascii="Times New Roman" w:eastAsia="Times New Roman" w:hAnsi="Times New Roman" w:cs="Times New Roman"/>
-                <w:color w:val="000000" w:themeColor="text1"/>
                 <w:kern w:val="0"/>
                 <w14:ligatures w14:val="none"/>
               </w:rPr>
@@ -1723,11 +1742,10 @@
             <w:r>
               <w:rPr>
                 <w:rFonts w:ascii="Times New Roman" w:eastAsia="Times New Roman" w:hAnsi="Times New Roman" w:cs="Times New Roman"/>
-                <w:color w:val="000000" w:themeColor="text1"/>
                 <w:kern w:val="0"/>
                 <w14:ligatures w14:val="none"/>
               </w:rPr>
-              <w:t>Chuẩn bị nguyên liệu, vận chuyển, kiểm tra chất lượng và đưa hàng vào vị trí lưu kho</w:t>
+              <w:t>Kiểm tra tồn kho</w:t>
             </w:r>
           </w:p>
         </w:tc>
@@ -1738,9 +1756,9 @@
           </w:tcPr>
           <w:p>
             <w:pPr>
+              <w:jc w:val="center"/>
               <w:rPr>
                 <w:rFonts w:ascii="Times New Roman" w:eastAsia="Times New Roman" w:hAnsi="Times New Roman" w:cs="Times New Roman"/>
-                <w:color w:val="000000" w:themeColor="text1"/>
                 <w:kern w:val="0"/>
                 <w14:ligatures w14:val="none"/>
               </w:rPr>
@@ -1748,11 +1766,35 @@
             <w:r>
               <w:rPr>
                 <w:rFonts w:ascii="Times New Roman" w:eastAsia="Times New Roman" w:hAnsi="Times New Roman" w:cs="Times New Roman"/>
-                <w:color w:val="000000" w:themeColor="text1"/>
+                <w:b/>
+                <w:bCs/>
                 <w:kern w:val="0"/>
                 <w14:ligatures w14:val="none"/>
               </w:rPr>
-              <w:t>810 phút</w:t>
+              <w:t>BVA</w:t>
+            </w:r>
+          </w:p>
+        </w:tc>
+        <w:tc>
+          <w:tcPr>
+            <w:tcW w:w="0" w:type="auto"/>
+            <w:hideMark/>
+          </w:tcPr>
+          <w:p>
+            <w:pPr>
+              <w:rPr>
+                <w:rFonts w:ascii="Times New Roman" w:eastAsia="Times New Roman" w:hAnsi="Times New Roman" w:cs="Times New Roman"/>
+                <w:kern w:val="0"/>
+                <w14:ligatures w14:val="none"/>
+              </w:rPr>
+            </w:pPr>
+            <w:r>
+              <w:rPr>
+                <w:rFonts w:ascii="Times New Roman" w:eastAsia="Times New Roman" w:hAnsi="Times New Roman" w:cs="Times New Roman"/>
+                <w:kern w:val="0"/>
+                <w14:ligatures w14:val="none"/>
+              </w:rPr>
+              <w:t>Cần để xác định lượng tồn và nhu cầu đặt hàng</w:t>
             </w:r>
           </w:p>
         </w:tc>
@@ -1765,9 +1807,9 @@
           </w:tcPr>
           <w:p>
             <w:pPr>
+              <w:jc w:val="right"/>
               <w:rPr>
                 <w:rFonts w:ascii="Times New Roman" w:eastAsia="Times New Roman" w:hAnsi="Times New Roman" w:cs="Times New Roman"/>
-                <w:color w:val="000000" w:themeColor="text1"/>
                 <w:kern w:val="0"/>
                 <w14:ligatures w14:val="none"/>
               </w:rPr>
@@ -1775,14 +1817,11 @@
             <w:r>
               <w:rPr>
                 <w:rFonts w:ascii="Times New Roman" w:eastAsia="Times New Roman" w:hAnsi="Times New Roman" w:cs="Times New Roman"/>
-                <w:b/>
-                <w:bCs/>
-                <w:color w:val="000000" w:themeColor="text1"/>
                 <w:kern w:val="0"/>
                 <w14:ligatures w14:val="none"/>
               </w:rPr>
               <w:lastRenderedPageBreak/>
-              <w:t>BVA – Không tạo giá trị trực tiếp nhưng cần thiết</w:t>
+              <w:t>2</w:t>
             </w:r>
           </w:p>
         </w:tc>
@@ -1795,7 +1834,6 @@
             <w:pPr>
               <w:rPr>
                 <w:rFonts w:ascii="Times New Roman" w:eastAsia="Times New Roman" w:hAnsi="Times New Roman" w:cs="Times New Roman"/>
-                <w:color w:val="000000" w:themeColor="text1"/>
                 <w:kern w:val="0"/>
                 <w14:ligatures w14:val="none"/>
               </w:rPr>
@@ -1803,11 +1841,10 @@
             <w:r>
               <w:rPr>
                 <w:rFonts w:ascii="Times New Roman" w:eastAsia="Times New Roman" w:hAnsi="Times New Roman" w:cs="Times New Roman"/>
-                <w:color w:val="000000" w:themeColor="text1"/>
                 <w:kern w:val="0"/>
                 <w14:ligatures w14:val="none"/>
               </w:rPr>
-              <w:t>Kiểm tra tồn kho, lập và duyệt PO, lựa chọn nhà cung cấp, đối chiếu chứng từ, nhập ERP và làm thủ tục thanh toán</w:t>
+              <w:t>Lập đề nghị mua</w:t>
             </w:r>
           </w:p>
         </w:tc>
@@ -1818,9 +1855,9 @@
           </w:tcPr>
           <w:p>
             <w:pPr>
+              <w:jc w:val="center"/>
               <w:rPr>
                 <w:rFonts w:ascii="Times New Roman" w:eastAsia="Times New Roman" w:hAnsi="Times New Roman" w:cs="Times New Roman"/>
-                <w:color w:val="000000" w:themeColor="text1"/>
                 <w:kern w:val="0"/>
                 <w14:ligatures w14:val="none"/>
               </w:rPr>
@@ -1828,11 +1865,35 @@
             <w:r>
               <w:rPr>
                 <w:rFonts w:ascii="Times New Roman" w:eastAsia="Times New Roman" w:hAnsi="Times New Roman" w:cs="Times New Roman"/>
-                <w:color w:val="000000" w:themeColor="text1"/>
+                <w:b/>
+                <w:bCs/>
                 <w:kern w:val="0"/>
                 <w14:ligatures w14:val="none"/>
               </w:rPr>
-              <w:t>240 phút</w:t>
+              <w:t>BVA</w:t>
+            </w:r>
+          </w:p>
+        </w:tc>
+        <w:tc>
+          <w:tcPr>
+            <w:tcW w:w="0" w:type="auto"/>
+            <w:hideMark/>
+          </w:tcPr>
+          <w:p>
+            <w:pPr>
+              <w:rPr>
+                <w:rFonts w:ascii="Times New Roman" w:eastAsia="Times New Roman" w:hAnsi="Times New Roman" w:cs="Times New Roman"/>
+                <w:kern w:val="0"/>
+                <w14:ligatures w14:val="none"/>
+              </w:rPr>
+            </w:pPr>
+            <w:r>
+              <w:rPr>
+                <w:rFonts w:ascii="Times New Roman" w:eastAsia="Times New Roman" w:hAnsi="Times New Roman" w:cs="Times New Roman"/>
+                <w:kern w:val="0"/>
+                <w14:ligatures w14:val="none"/>
+              </w:rPr>
+              <w:t>Cần để chính thức hóa nhu cầu mua nguyên liệu</w:t>
             </w:r>
           </w:p>
         </w:tc>
@@ -1845,9 +1906,9 @@
           </w:tcPr>
           <w:p>
             <w:pPr>
+              <w:jc w:val="right"/>
               <w:rPr>
                 <w:rFonts w:ascii="Times New Roman" w:eastAsia="Times New Roman" w:hAnsi="Times New Roman" w:cs="Times New Roman"/>
-                <w:color w:val="000000" w:themeColor="text1"/>
                 <w:kern w:val="0"/>
                 <w14:ligatures w14:val="none"/>
               </w:rPr>
@@ -1855,13 +1916,10 @@
             <w:r>
               <w:rPr>
                 <w:rFonts w:ascii="Times New Roman" w:eastAsia="Times New Roman" w:hAnsi="Times New Roman" w:cs="Times New Roman"/>
-                <w:b/>
-                <w:bCs/>
-                <w:color w:val="000000" w:themeColor="text1"/>
                 <w:kern w:val="0"/>
                 <w14:ligatures w14:val="none"/>
               </w:rPr>
-              <w:t>NVA – Không tạo giá trị</w:t>
+              <w:t>3</w:t>
             </w:r>
           </w:p>
         </w:tc>
@@ -1874,7 +1932,6 @@
             <w:pPr>
               <w:rPr>
                 <w:rFonts w:ascii="Times New Roman" w:eastAsia="Times New Roman" w:hAnsi="Times New Roman" w:cs="Times New Roman"/>
-                <w:color w:val="000000" w:themeColor="text1"/>
                 <w:kern w:val="0"/>
                 <w14:ligatures w14:val="none"/>
               </w:rPr>
@@ -1882,11 +1939,10 @@
             <w:r>
               <w:rPr>
                 <w:rFonts w:ascii="Times New Roman" w:eastAsia="Times New Roman" w:hAnsi="Times New Roman" w:cs="Times New Roman"/>
-                <w:color w:val="000000" w:themeColor="text1"/>
                 <w:kern w:val="0"/>
                 <w14:ligatures w14:val="none"/>
               </w:rPr>
-              <w:t>Chờ phê duyệt, chờ nhà cung cấp, chờ kiểm tra QC và chờ xử lý chứng từ</w:t>
+              <w:t>Xác minh và chuyển yêu cầu mua</w:t>
             </w:r>
           </w:p>
         </w:tc>
@@ -1897,9 +1953,9 @@
           </w:tcPr>
           <w:p>
             <w:pPr>
+              <w:jc w:val="center"/>
               <w:rPr>
                 <w:rFonts w:ascii="Times New Roman" w:eastAsia="Times New Roman" w:hAnsi="Times New Roman" w:cs="Times New Roman"/>
-                <w:color w:val="000000" w:themeColor="text1"/>
                 <w:kern w:val="0"/>
                 <w14:ligatures w14:val="none"/>
               </w:rPr>
@@ -1907,11 +1963,1603 @@
             <w:r>
               <w:rPr>
                 <w:rFonts w:ascii="Times New Roman" w:eastAsia="Times New Roman" w:hAnsi="Times New Roman" w:cs="Times New Roman"/>
-                <w:color w:val="000000" w:themeColor="text1"/>
+                <w:b/>
+                <w:bCs/>
                 <w:kern w:val="0"/>
                 <w14:ligatures w14:val="none"/>
               </w:rPr>
-              <w:t>1.080 phút</w:t>
+              <w:t>BVA</w:t>
+            </w:r>
+          </w:p>
+        </w:tc>
+        <w:tc>
+          <w:tcPr>
+            <w:tcW w:w="0" w:type="auto"/>
+            <w:hideMark/>
+          </w:tcPr>
+          <w:p>
+            <w:pPr>
+              <w:rPr>
+                <w:rFonts w:ascii="Times New Roman" w:eastAsia="Times New Roman" w:hAnsi="Times New Roman" w:cs="Times New Roman"/>
+                <w:kern w:val="0"/>
+                <w14:ligatures w14:val="none"/>
+              </w:rPr>
+            </w:pPr>
+            <w:r>
+              <w:rPr>
+                <w:rFonts w:ascii="Times New Roman" w:eastAsia="Times New Roman" w:hAnsi="Times New Roman" w:cs="Times New Roman"/>
+                <w:kern w:val="0"/>
+                <w14:ligatures w14:val="none"/>
+              </w:rPr>
+              <w:t>Cần kiểm soát nhu cầu trước khi chuyển sang mua hàng</w:t>
+            </w:r>
+          </w:p>
+        </w:tc>
+      </w:tr>
+      <w:tr>
+        <w:tc>
+          <w:tcPr>
+            <w:tcW w:w="0" w:type="auto"/>
+            <w:hideMark/>
+          </w:tcPr>
+          <w:p>
+            <w:pPr>
+              <w:jc w:val="right"/>
+              <w:rPr>
+                <w:rFonts w:ascii="Times New Roman" w:eastAsia="Times New Roman" w:hAnsi="Times New Roman" w:cs="Times New Roman"/>
+                <w:kern w:val="0"/>
+                <w14:ligatures w14:val="none"/>
+              </w:rPr>
+            </w:pPr>
+            <w:r>
+              <w:rPr>
+                <w:rFonts w:ascii="Times New Roman" w:eastAsia="Times New Roman" w:hAnsi="Times New Roman" w:cs="Times New Roman"/>
+                <w:kern w:val="0"/>
+                <w14:ligatures w14:val="none"/>
+              </w:rPr>
+              <w:t>4</w:t>
+            </w:r>
+          </w:p>
+        </w:tc>
+        <w:tc>
+          <w:tcPr>
+            <w:tcW w:w="0" w:type="auto"/>
+            <w:hideMark/>
+          </w:tcPr>
+          <w:p>
+            <w:pPr>
+              <w:rPr>
+                <w:rFonts w:ascii="Times New Roman" w:eastAsia="Times New Roman" w:hAnsi="Times New Roman" w:cs="Times New Roman"/>
+                <w:kern w:val="0"/>
+                <w14:ligatures w14:val="none"/>
+              </w:rPr>
+            </w:pPr>
+            <w:r>
+              <w:rPr>
+                <w:rFonts w:ascii="Times New Roman" w:eastAsia="Times New Roman" w:hAnsi="Times New Roman" w:cs="Times New Roman"/>
+                <w:kern w:val="0"/>
+                <w14:ligatures w14:val="none"/>
+              </w:rPr>
+              <w:t>Lập và trình duyệt PO</w:t>
+            </w:r>
+          </w:p>
+        </w:tc>
+        <w:tc>
+          <w:tcPr>
+            <w:tcW w:w="0" w:type="auto"/>
+            <w:hideMark/>
+          </w:tcPr>
+          <w:p>
+            <w:pPr>
+              <w:jc w:val="center"/>
+              <w:rPr>
+                <w:rFonts w:ascii="Times New Roman" w:eastAsia="Times New Roman" w:hAnsi="Times New Roman" w:cs="Times New Roman"/>
+                <w:kern w:val="0"/>
+                <w14:ligatures w14:val="none"/>
+              </w:rPr>
+            </w:pPr>
+            <w:r>
+              <w:rPr>
+                <w:rFonts w:ascii="Times New Roman" w:eastAsia="Times New Roman" w:hAnsi="Times New Roman" w:cs="Times New Roman"/>
+                <w:b/>
+                <w:bCs/>
+                <w:kern w:val="0"/>
+                <w14:ligatures w14:val="none"/>
+              </w:rPr>
+              <w:t>BVA</w:t>
+            </w:r>
+          </w:p>
+        </w:tc>
+        <w:tc>
+          <w:tcPr>
+            <w:tcW w:w="0" w:type="auto"/>
+            <w:hideMark/>
+          </w:tcPr>
+          <w:p>
+            <w:pPr>
+              <w:rPr>
+                <w:rFonts w:ascii="Times New Roman" w:eastAsia="Times New Roman" w:hAnsi="Times New Roman" w:cs="Times New Roman"/>
+                <w:kern w:val="0"/>
+                <w14:ligatures w14:val="none"/>
+              </w:rPr>
+            </w:pPr>
+            <w:r>
+              <w:rPr>
+                <w:rFonts w:ascii="Times New Roman" w:eastAsia="Times New Roman" w:hAnsi="Times New Roman" w:cs="Times New Roman"/>
+                <w:kern w:val="0"/>
+                <w14:ligatures w14:val="none"/>
+              </w:rPr>
+              <w:t>Cần cho kiểm soát đơn hàng, ngân sách và phê duyệt</w:t>
+            </w:r>
+          </w:p>
+        </w:tc>
+      </w:tr>
+      <w:tr>
+        <w:tc>
+          <w:tcPr>
+            <w:tcW w:w="0" w:type="auto"/>
+            <w:hideMark/>
+          </w:tcPr>
+          <w:p>
+            <w:pPr>
+              <w:jc w:val="right"/>
+              <w:rPr>
+                <w:rFonts w:ascii="Times New Roman" w:eastAsia="Times New Roman" w:hAnsi="Times New Roman" w:cs="Times New Roman"/>
+                <w:kern w:val="0"/>
+                <w14:ligatures w14:val="none"/>
+              </w:rPr>
+            </w:pPr>
+            <w:r>
+              <w:rPr>
+                <w:rFonts w:ascii="Times New Roman" w:eastAsia="Times New Roman" w:hAnsi="Times New Roman" w:cs="Times New Roman"/>
+                <w:kern w:val="0"/>
+                <w14:ligatures w14:val="none"/>
+              </w:rPr>
+              <w:t>5</w:t>
+            </w:r>
+          </w:p>
+        </w:tc>
+        <w:tc>
+          <w:tcPr>
+            <w:tcW w:w="0" w:type="auto"/>
+            <w:hideMark/>
+          </w:tcPr>
+          <w:p>
+            <w:pPr>
+              <w:rPr>
+                <w:rFonts w:ascii="Times New Roman" w:eastAsia="Times New Roman" w:hAnsi="Times New Roman" w:cs="Times New Roman"/>
+                <w:kern w:val="0"/>
+                <w14:ligatures w14:val="none"/>
+              </w:rPr>
+            </w:pPr>
+            <w:r>
+              <w:rPr>
+                <w:rFonts w:ascii="Times New Roman" w:eastAsia="Times New Roman" w:hAnsi="Times New Roman" w:cs="Times New Roman"/>
+                <w:kern w:val="0"/>
+                <w14:ligatures w14:val="none"/>
+              </w:rPr>
+              <w:t>Kiểm tra nhà cung cấp</w:t>
+            </w:r>
+          </w:p>
+        </w:tc>
+        <w:tc>
+          <w:tcPr>
+            <w:tcW w:w="0" w:type="auto"/>
+            <w:hideMark/>
+          </w:tcPr>
+          <w:p>
+            <w:pPr>
+              <w:jc w:val="center"/>
+              <w:rPr>
+                <w:rFonts w:ascii="Times New Roman" w:eastAsia="Times New Roman" w:hAnsi="Times New Roman" w:cs="Times New Roman"/>
+                <w:kern w:val="0"/>
+                <w14:ligatures w14:val="none"/>
+              </w:rPr>
+            </w:pPr>
+            <w:r>
+              <w:rPr>
+                <w:rFonts w:ascii="Times New Roman" w:eastAsia="Times New Roman" w:hAnsi="Times New Roman" w:cs="Times New Roman"/>
+                <w:b/>
+                <w:bCs/>
+                <w:kern w:val="0"/>
+                <w14:ligatures w14:val="none"/>
+              </w:rPr>
+              <w:t>BVA</w:t>
+            </w:r>
+          </w:p>
+        </w:tc>
+        <w:tc>
+          <w:tcPr>
+            <w:tcW w:w="0" w:type="auto"/>
+            <w:hideMark/>
+          </w:tcPr>
+          <w:p>
+            <w:pPr>
+              <w:rPr>
+                <w:rFonts w:ascii="Times New Roman" w:eastAsia="Times New Roman" w:hAnsi="Times New Roman" w:cs="Times New Roman"/>
+                <w:kern w:val="0"/>
+                <w14:ligatures w14:val="none"/>
+              </w:rPr>
+            </w:pPr>
+            <w:r>
+              <w:rPr>
+                <w:rFonts w:ascii="Times New Roman" w:eastAsia="Times New Roman" w:hAnsi="Times New Roman" w:cs="Times New Roman"/>
+                <w:kern w:val="0"/>
+                <w14:ligatures w14:val="none"/>
+              </w:rPr>
+              <w:t>Đảm bảo nhà cung cấp đáp ứng yêu cầu</w:t>
+            </w:r>
+          </w:p>
+        </w:tc>
+      </w:tr>
+      <w:tr>
+        <w:tc>
+          <w:tcPr>
+            <w:tcW w:w="0" w:type="auto"/>
+            <w:hideMark/>
+          </w:tcPr>
+          <w:p>
+            <w:pPr>
+              <w:jc w:val="right"/>
+              <w:rPr>
+                <w:rFonts w:ascii="Times New Roman" w:eastAsia="Times New Roman" w:hAnsi="Times New Roman" w:cs="Times New Roman"/>
+                <w:kern w:val="0"/>
+                <w14:ligatures w14:val="none"/>
+              </w:rPr>
+            </w:pPr>
+            <w:r>
+              <w:rPr>
+                <w:rFonts w:ascii="Times New Roman" w:eastAsia="Times New Roman" w:hAnsi="Times New Roman" w:cs="Times New Roman"/>
+                <w:kern w:val="0"/>
+                <w14:ligatures w14:val="none"/>
+              </w:rPr>
+              <w:t>6</w:t>
+            </w:r>
+          </w:p>
+        </w:tc>
+        <w:tc>
+          <w:tcPr>
+            <w:tcW w:w="0" w:type="auto"/>
+            <w:hideMark/>
+          </w:tcPr>
+          <w:p>
+            <w:pPr>
+              <w:rPr>
+                <w:rFonts w:ascii="Times New Roman" w:eastAsia="Times New Roman" w:hAnsi="Times New Roman" w:cs="Times New Roman"/>
+                <w:kern w:val="0"/>
+                <w14:ligatures w14:val="none"/>
+              </w:rPr>
+            </w:pPr>
+            <w:r>
+              <w:rPr>
+                <w:rFonts w:ascii="Times New Roman" w:eastAsia="Times New Roman" w:hAnsi="Times New Roman" w:cs="Times New Roman"/>
+                <w:kern w:val="0"/>
+                <w14:ligatures w14:val="none"/>
+              </w:rPr>
+              <w:t>Phát hành PO</w:t>
+            </w:r>
+          </w:p>
+        </w:tc>
+        <w:tc>
+          <w:tcPr>
+            <w:tcW w:w="0" w:type="auto"/>
+            <w:hideMark/>
+          </w:tcPr>
+          <w:p>
+            <w:pPr>
+              <w:jc w:val="center"/>
+              <w:rPr>
+                <w:rFonts w:ascii="Times New Roman" w:eastAsia="Times New Roman" w:hAnsi="Times New Roman" w:cs="Times New Roman"/>
+                <w:kern w:val="0"/>
+                <w14:ligatures w14:val="none"/>
+              </w:rPr>
+            </w:pPr>
+            <w:r>
+              <w:rPr>
+                <w:rFonts w:ascii="Times New Roman" w:eastAsia="Times New Roman" w:hAnsi="Times New Roman" w:cs="Times New Roman"/>
+                <w:b/>
+                <w:bCs/>
+                <w:kern w:val="0"/>
+                <w14:ligatures w14:val="none"/>
+              </w:rPr>
+              <w:t>BVA</w:t>
+            </w:r>
+          </w:p>
+        </w:tc>
+        <w:tc>
+          <w:tcPr>
+            <w:tcW w:w="0" w:type="auto"/>
+            <w:hideMark/>
+          </w:tcPr>
+          <w:p>
+            <w:pPr>
+              <w:rPr>
+                <w:rFonts w:ascii="Times New Roman" w:eastAsia="Times New Roman" w:hAnsi="Times New Roman" w:cs="Times New Roman"/>
+                <w:kern w:val="0"/>
+                <w14:ligatures w14:val="none"/>
+              </w:rPr>
+            </w:pPr>
+            <w:r>
+              <w:rPr>
+                <w:rFonts w:ascii="Times New Roman" w:eastAsia="Times New Roman" w:hAnsi="Times New Roman" w:cs="Times New Roman"/>
+                <w:kern w:val="0"/>
+                <w14:ligatures w14:val="none"/>
+              </w:rPr>
+              <w:t>Chính thức hóa đơn đặt hàng với nhà cung cấp</w:t>
+            </w:r>
+          </w:p>
+        </w:tc>
+      </w:tr>
+      <w:tr>
+        <w:tc>
+          <w:tcPr>
+            <w:tcW w:w="0" w:type="auto"/>
+            <w:hideMark/>
+          </w:tcPr>
+          <w:p>
+            <w:pPr>
+              <w:jc w:val="right"/>
+              <w:rPr>
+                <w:rFonts w:ascii="Times New Roman" w:eastAsia="Times New Roman" w:hAnsi="Times New Roman" w:cs="Times New Roman"/>
+                <w:kern w:val="0"/>
+                <w14:ligatures w14:val="none"/>
+              </w:rPr>
+            </w:pPr>
+            <w:r>
+              <w:rPr>
+                <w:rFonts w:ascii="Times New Roman" w:eastAsia="Times New Roman" w:hAnsi="Times New Roman" w:cs="Times New Roman"/>
+                <w:kern w:val="0"/>
+                <w14:ligatures w14:val="none"/>
+              </w:rPr>
+              <w:t>7</w:t>
+            </w:r>
+          </w:p>
+        </w:tc>
+        <w:tc>
+          <w:tcPr>
+            <w:tcW w:w="0" w:type="auto"/>
+            <w:hideMark/>
+          </w:tcPr>
+          <w:p>
+            <w:pPr>
+              <w:rPr>
+                <w:rFonts w:ascii="Times New Roman" w:eastAsia="Times New Roman" w:hAnsi="Times New Roman" w:cs="Times New Roman"/>
+                <w:kern w:val="0"/>
+                <w14:ligatures w14:val="none"/>
+              </w:rPr>
+            </w:pPr>
+            <w:r>
+              <w:rPr>
+                <w:rFonts w:ascii="Times New Roman" w:eastAsia="Times New Roman" w:hAnsi="Times New Roman" w:cs="Times New Roman"/>
+                <w:kern w:val="0"/>
+                <w14:ligatures w14:val="none"/>
+              </w:rPr>
+              <w:t>Nhà cung cấp chuẩn bị hàng</w:t>
+            </w:r>
+          </w:p>
+        </w:tc>
+        <w:tc>
+          <w:tcPr>
+            <w:tcW w:w="0" w:type="auto"/>
+            <w:hideMark/>
+          </w:tcPr>
+          <w:p>
+            <w:pPr>
+              <w:jc w:val="center"/>
+              <w:rPr>
+                <w:rFonts w:ascii="Times New Roman" w:eastAsia="Times New Roman" w:hAnsi="Times New Roman" w:cs="Times New Roman"/>
+                <w:kern w:val="0"/>
+                <w14:ligatures w14:val="none"/>
+              </w:rPr>
+            </w:pPr>
+            <w:r>
+              <w:rPr>
+                <w:rFonts w:ascii="Times New Roman" w:eastAsia="Times New Roman" w:hAnsi="Times New Roman" w:cs="Times New Roman"/>
+                <w:b/>
+                <w:bCs/>
+                <w:kern w:val="0"/>
+                <w14:ligatures w14:val="none"/>
+              </w:rPr>
+              <w:t>VA</w:t>
+            </w:r>
+          </w:p>
+        </w:tc>
+        <w:tc>
+          <w:tcPr>
+            <w:tcW w:w="0" w:type="auto"/>
+            <w:hideMark/>
+          </w:tcPr>
+          <w:p>
+            <w:pPr>
+              <w:rPr>
+                <w:rFonts w:ascii="Times New Roman" w:eastAsia="Times New Roman" w:hAnsi="Times New Roman" w:cs="Times New Roman"/>
+                <w:kern w:val="0"/>
+                <w14:ligatures w14:val="none"/>
+              </w:rPr>
+            </w:pPr>
+            <w:r>
+              <w:rPr>
+                <w:rFonts w:ascii="Times New Roman" w:eastAsia="Times New Roman" w:hAnsi="Times New Roman" w:cs="Times New Roman"/>
+                <w:kern w:val="0"/>
+                <w14:ligatures w14:val="none"/>
+              </w:rPr>
+              <w:t>Trực tiếp chuẩn bị nguyên liệu theo yêu cầu đặt hàng</w:t>
+            </w:r>
+          </w:p>
+        </w:tc>
+      </w:tr>
+      <w:tr>
+        <w:tc>
+          <w:tcPr>
+            <w:tcW w:w="0" w:type="auto"/>
+            <w:hideMark/>
+          </w:tcPr>
+          <w:p>
+            <w:pPr>
+              <w:jc w:val="right"/>
+              <w:rPr>
+                <w:rFonts w:ascii="Times New Roman" w:eastAsia="Times New Roman" w:hAnsi="Times New Roman" w:cs="Times New Roman"/>
+                <w:kern w:val="0"/>
+                <w14:ligatures w14:val="none"/>
+              </w:rPr>
+            </w:pPr>
+            <w:r>
+              <w:rPr>
+                <w:rFonts w:ascii="Times New Roman" w:eastAsia="Times New Roman" w:hAnsi="Times New Roman" w:cs="Times New Roman"/>
+                <w:kern w:val="0"/>
+                <w14:ligatures w14:val="none"/>
+              </w:rPr>
+              <w:t>8</w:t>
+            </w:r>
+          </w:p>
+        </w:tc>
+        <w:tc>
+          <w:tcPr>
+            <w:tcW w:w="0" w:type="auto"/>
+            <w:hideMark/>
+          </w:tcPr>
+          <w:p>
+            <w:pPr>
+              <w:rPr>
+                <w:rFonts w:ascii="Times New Roman" w:eastAsia="Times New Roman" w:hAnsi="Times New Roman" w:cs="Times New Roman"/>
+                <w:kern w:val="0"/>
+                <w14:ligatures w14:val="none"/>
+              </w:rPr>
+            </w:pPr>
+            <w:r>
+              <w:rPr>
+                <w:rFonts w:ascii="Times New Roman" w:eastAsia="Times New Roman" w:hAnsi="Times New Roman" w:cs="Times New Roman"/>
+                <w:kern w:val="0"/>
+                <w14:ligatures w14:val="none"/>
+              </w:rPr>
+              <w:t>Vận chuyển hàng và chứng từ</w:t>
+            </w:r>
+          </w:p>
+        </w:tc>
+        <w:tc>
+          <w:tcPr>
+            <w:tcW w:w="0" w:type="auto"/>
+            <w:hideMark/>
+          </w:tcPr>
+          <w:p>
+            <w:pPr>
+              <w:jc w:val="center"/>
+              <w:rPr>
+                <w:rFonts w:ascii="Times New Roman" w:eastAsia="Times New Roman" w:hAnsi="Times New Roman" w:cs="Times New Roman"/>
+                <w:kern w:val="0"/>
+                <w14:ligatures w14:val="none"/>
+              </w:rPr>
+            </w:pPr>
+            <w:r>
+              <w:rPr>
+                <w:rFonts w:ascii="Times New Roman" w:eastAsia="Times New Roman" w:hAnsi="Times New Roman" w:cs="Times New Roman"/>
+                <w:b/>
+                <w:bCs/>
+                <w:kern w:val="0"/>
+                <w14:ligatures w14:val="none"/>
+              </w:rPr>
+              <w:t>VA</w:t>
+            </w:r>
+          </w:p>
+        </w:tc>
+        <w:tc>
+          <w:tcPr>
+            <w:tcW w:w="0" w:type="auto"/>
+            <w:hideMark/>
+          </w:tcPr>
+          <w:p>
+            <w:pPr>
+              <w:rPr>
+                <w:rFonts w:ascii="Times New Roman" w:eastAsia="Times New Roman" w:hAnsi="Times New Roman" w:cs="Times New Roman"/>
+                <w:kern w:val="0"/>
+                <w14:ligatures w14:val="none"/>
+              </w:rPr>
+            </w:pPr>
+            <w:r>
+              <w:rPr>
+                <w:rFonts w:ascii="Times New Roman" w:eastAsia="Times New Roman" w:hAnsi="Times New Roman" w:cs="Times New Roman"/>
+                <w:kern w:val="0"/>
+                <w14:ligatures w14:val="none"/>
+              </w:rPr>
+              <w:t>Đưa nguyên liệu từ nhà cung cấp đến kho</w:t>
+            </w:r>
+          </w:p>
+        </w:tc>
+      </w:tr>
+      <w:tr>
+        <w:tc>
+          <w:tcPr>
+            <w:tcW w:w="0" w:type="auto"/>
+            <w:hideMark/>
+          </w:tcPr>
+          <w:p>
+            <w:pPr>
+              <w:jc w:val="right"/>
+              <w:rPr>
+                <w:rFonts w:ascii="Times New Roman" w:eastAsia="Times New Roman" w:hAnsi="Times New Roman" w:cs="Times New Roman"/>
+                <w:kern w:val="0"/>
+                <w14:ligatures w14:val="none"/>
+              </w:rPr>
+            </w:pPr>
+            <w:r>
+              <w:rPr>
+                <w:rFonts w:ascii="Times New Roman" w:eastAsia="Times New Roman" w:hAnsi="Times New Roman" w:cs="Times New Roman"/>
+                <w:kern w:val="0"/>
+                <w14:ligatures w14:val="none"/>
+              </w:rPr>
+              <w:t>9</w:t>
+            </w:r>
+          </w:p>
+        </w:tc>
+        <w:tc>
+          <w:tcPr>
+            <w:tcW w:w="0" w:type="auto"/>
+            <w:hideMark/>
+          </w:tcPr>
+          <w:p>
+            <w:pPr>
+              <w:rPr>
+                <w:rFonts w:ascii="Times New Roman" w:eastAsia="Times New Roman" w:hAnsi="Times New Roman" w:cs="Times New Roman"/>
+                <w:kern w:val="0"/>
+                <w14:ligatures w14:val="none"/>
+              </w:rPr>
+            </w:pPr>
+            <w:r>
+              <w:rPr>
+                <w:rFonts w:ascii="Times New Roman" w:eastAsia="Times New Roman" w:hAnsi="Times New Roman" w:cs="Times New Roman"/>
+                <w:kern w:val="0"/>
+                <w14:ligatures w14:val="none"/>
+              </w:rPr>
+              <w:t>Tiếp nhận và đối chiếu hàng</w:t>
+            </w:r>
+          </w:p>
+        </w:tc>
+        <w:tc>
+          <w:tcPr>
+            <w:tcW w:w="0" w:type="auto"/>
+            <w:hideMark/>
+          </w:tcPr>
+          <w:p>
+            <w:pPr>
+              <w:jc w:val="center"/>
+              <w:rPr>
+                <w:rFonts w:ascii="Times New Roman" w:eastAsia="Times New Roman" w:hAnsi="Times New Roman" w:cs="Times New Roman"/>
+                <w:kern w:val="0"/>
+                <w14:ligatures w14:val="none"/>
+              </w:rPr>
+            </w:pPr>
+            <w:r>
+              <w:rPr>
+                <w:rFonts w:ascii="Times New Roman" w:eastAsia="Times New Roman" w:hAnsi="Times New Roman" w:cs="Times New Roman"/>
+                <w:b/>
+                <w:bCs/>
+                <w:kern w:val="0"/>
+                <w14:ligatures w14:val="none"/>
+              </w:rPr>
+              <w:t>BVA</w:t>
+            </w:r>
+          </w:p>
+        </w:tc>
+        <w:tc>
+          <w:tcPr>
+            <w:tcW w:w="0" w:type="auto"/>
+            <w:hideMark/>
+          </w:tcPr>
+          <w:p>
+            <w:pPr>
+              <w:rPr>
+                <w:rFonts w:ascii="Times New Roman" w:eastAsia="Times New Roman" w:hAnsi="Times New Roman" w:cs="Times New Roman"/>
+                <w:kern w:val="0"/>
+                <w14:ligatures w14:val="none"/>
+              </w:rPr>
+            </w:pPr>
+            <w:r>
+              <w:rPr>
+                <w:rFonts w:ascii="Times New Roman" w:eastAsia="Times New Roman" w:hAnsi="Times New Roman" w:cs="Times New Roman"/>
+                <w:kern w:val="0"/>
+                <w14:ligatures w14:val="none"/>
+              </w:rPr>
+              <w:t>Kiểm soát hàng thực nhận so với PO và chứng từ</w:t>
+            </w:r>
+          </w:p>
+        </w:tc>
+      </w:tr>
+      <w:tr>
+        <w:tc>
+          <w:tcPr>
+            <w:tcW w:w="0" w:type="auto"/>
+            <w:hideMark/>
+          </w:tcPr>
+          <w:p>
+            <w:pPr>
+              <w:jc w:val="right"/>
+              <w:rPr>
+                <w:rFonts w:ascii="Times New Roman" w:eastAsia="Times New Roman" w:hAnsi="Times New Roman" w:cs="Times New Roman"/>
+                <w:kern w:val="0"/>
+                <w14:ligatures w14:val="none"/>
+              </w:rPr>
+            </w:pPr>
+            <w:r>
+              <w:rPr>
+                <w:rFonts w:ascii="Times New Roman" w:eastAsia="Times New Roman" w:hAnsi="Times New Roman" w:cs="Times New Roman"/>
+                <w:kern w:val="0"/>
+                <w14:ligatures w14:val="none"/>
+              </w:rPr>
+              <w:t>10</w:t>
+            </w:r>
+          </w:p>
+        </w:tc>
+        <w:tc>
+          <w:tcPr>
+            <w:tcW w:w="0" w:type="auto"/>
+            <w:hideMark/>
+          </w:tcPr>
+          <w:p>
+            <w:pPr>
+              <w:rPr>
+                <w:rFonts w:ascii="Times New Roman" w:eastAsia="Times New Roman" w:hAnsi="Times New Roman" w:cs="Times New Roman"/>
+                <w:kern w:val="0"/>
+                <w14:ligatures w14:val="none"/>
+              </w:rPr>
+            </w:pPr>
+            <w:r>
+              <w:rPr>
+                <w:rFonts w:ascii="Times New Roman" w:eastAsia="Times New Roman" w:hAnsi="Times New Roman" w:cs="Times New Roman"/>
+                <w:kern w:val="0"/>
+                <w14:ligatures w14:val="none"/>
+              </w:rPr>
+              <w:t>Kiểm tra chất lượng</w:t>
+            </w:r>
+          </w:p>
+        </w:tc>
+        <w:tc>
+          <w:tcPr>
+            <w:tcW w:w="0" w:type="auto"/>
+            <w:hideMark/>
+          </w:tcPr>
+          <w:p>
+            <w:pPr>
+              <w:jc w:val="center"/>
+              <w:rPr>
+                <w:rFonts w:ascii="Times New Roman" w:eastAsia="Times New Roman" w:hAnsi="Times New Roman" w:cs="Times New Roman"/>
+                <w:kern w:val="0"/>
+                <w14:ligatures w14:val="none"/>
+              </w:rPr>
+            </w:pPr>
+            <w:r>
+              <w:rPr>
+                <w:rFonts w:ascii="Times New Roman" w:eastAsia="Times New Roman" w:hAnsi="Times New Roman" w:cs="Times New Roman"/>
+                <w:b/>
+                <w:bCs/>
+                <w:kern w:val="0"/>
+                <w14:ligatures w14:val="none"/>
+              </w:rPr>
+              <w:t>VA</w:t>
+            </w:r>
+          </w:p>
+        </w:tc>
+        <w:tc>
+          <w:tcPr>
+            <w:tcW w:w="0" w:type="auto"/>
+            <w:hideMark/>
+          </w:tcPr>
+          <w:p>
+            <w:pPr>
+              <w:rPr>
+                <w:rFonts w:ascii="Times New Roman" w:eastAsia="Times New Roman" w:hAnsi="Times New Roman" w:cs="Times New Roman"/>
+                <w:kern w:val="0"/>
+                <w14:ligatures w14:val="none"/>
+              </w:rPr>
+            </w:pPr>
+            <w:r>
+              <w:rPr>
+                <w:rFonts w:ascii="Times New Roman" w:eastAsia="Times New Roman" w:hAnsi="Times New Roman" w:cs="Times New Roman"/>
+                <w:kern w:val="0"/>
+                <w14:ligatures w14:val="none"/>
+              </w:rPr>
+              <w:t>Xác nhận nguyên liệu đáp ứng yêu cầu chất lượng</w:t>
+            </w:r>
+          </w:p>
+        </w:tc>
+      </w:tr>
+      <w:tr>
+        <w:tc>
+          <w:tcPr>
+            <w:tcW w:w="0" w:type="auto"/>
+            <w:hideMark/>
+          </w:tcPr>
+          <w:p>
+            <w:pPr>
+              <w:jc w:val="right"/>
+              <w:rPr>
+                <w:rFonts w:ascii="Times New Roman" w:eastAsia="Times New Roman" w:hAnsi="Times New Roman" w:cs="Times New Roman"/>
+                <w:kern w:val="0"/>
+                <w14:ligatures w14:val="none"/>
+              </w:rPr>
+            </w:pPr>
+            <w:r>
+              <w:rPr>
+                <w:rFonts w:ascii="Times New Roman" w:eastAsia="Times New Roman" w:hAnsi="Times New Roman" w:cs="Times New Roman"/>
+                <w:kern w:val="0"/>
+                <w14:ligatures w14:val="none"/>
+              </w:rPr>
+              <w:t>11</w:t>
+            </w:r>
+          </w:p>
+        </w:tc>
+        <w:tc>
+          <w:tcPr>
+            <w:tcW w:w="0" w:type="auto"/>
+            <w:hideMark/>
+          </w:tcPr>
+          <w:p>
+            <w:pPr>
+              <w:rPr>
+                <w:rFonts w:ascii="Times New Roman" w:eastAsia="Times New Roman" w:hAnsi="Times New Roman" w:cs="Times New Roman"/>
+                <w:kern w:val="0"/>
+                <w14:ligatures w14:val="none"/>
+              </w:rPr>
+            </w:pPr>
+            <w:r>
+              <w:rPr>
+                <w:rFonts w:ascii="Times New Roman" w:eastAsia="Times New Roman" w:hAnsi="Times New Roman" w:cs="Times New Roman"/>
+                <w:kern w:val="0"/>
+                <w14:ligatures w14:val="none"/>
+              </w:rPr>
+              <w:t>Nhập kho, ghi mã lô và FEFO</w:t>
+            </w:r>
+          </w:p>
+        </w:tc>
+        <w:tc>
+          <w:tcPr>
+            <w:tcW w:w="0" w:type="auto"/>
+            <w:hideMark/>
+          </w:tcPr>
+          <w:p>
+            <w:pPr>
+              <w:jc w:val="center"/>
+              <w:rPr>
+                <w:rFonts w:ascii="Times New Roman" w:eastAsia="Times New Roman" w:hAnsi="Times New Roman" w:cs="Times New Roman"/>
+                <w:kern w:val="0"/>
+                <w14:ligatures w14:val="none"/>
+              </w:rPr>
+            </w:pPr>
+            <w:r>
+              <w:rPr>
+                <w:rFonts w:ascii="Times New Roman" w:eastAsia="Times New Roman" w:hAnsi="Times New Roman" w:cs="Times New Roman"/>
+                <w:b/>
+                <w:bCs/>
+                <w:kern w:val="0"/>
+                <w14:ligatures w14:val="none"/>
+              </w:rPr>
+              <w:t>BVA</w:t>
+            </w:r>
+          </w:p>
+        </w:tc>
+        <w:tc>
+          <w:tcPr>
+            <w:tcW w:w="0" w:type="auto"/>
+            <w:hideMark/>
+          </w:tcPr>
+          <w:p>
+            <w:pPr>
+              <w:rPr>
+                <w:rFonts w:ascii="Times New Roman" w:eastAsia="Times New Roman" w:hAnsi="Times New Roman" w:cs="Times New Roman"/>
+                <w:kern w:val="0"/>
+                <w14:ligatures w14:val="none"/>
+              </w:rPr>
+            </w:pPr>
+            <w:r>
+              <w:rPr>
+                <w:rFonts w:ascii="Times New Roman" w:eastAsia="Times New Roman" w:hAnsi="Times New Roman" w:cs="Times New Roman"/>
+                <w:kern w:val="0"/>
+                <w14:ligatures w14:val="none"/>
+              </w:rPr>
+              <w:t>Cần cho quản lý, truy xuất và kiểm soát tồn kho</w:t>
+            </w:r>
+          </w:p>
+        </w:tc>
+      </w:tr>
+      <w:tr>
+        <w:tc>
+          <w:tcPr>
+            <w:tcW w:w="0" w:type="auto"/>
+            <w:hideMark/>
+          </w:tcPr>
+          <w:p>
+            <w:pPr>
+              <w:jc w:val="right"/>
+              <w:rPr>
+                <w:rFonts w:ascii="Times New Roman" w:eastAsia="Times New Roman" w:hAnsi="Times New Roman" w:cs="Times New Roman"/>
+                <w:kern w:val="0"/>
+                <w14:ligatures w14:val="none"/>
+              </w:rPr>
+            </w:pPr>
+            <w:r>
+              <w:rPr>
+                <w:rFonts w:ascii="Times New Roman" w:eastAsia="Times New Roman" w:hAnsi="Times New Roman" w:cs="Times New Roman"/>
+                <w:kern w:val="0"/>
+                <w14:ligatures w14:val="none"/>
+              </w:rPr>
+              <w:t>12</w:t>
+            </w:r>
+          </w:p>
+        </w:tc>
+        <w:tc>
+          <w:tcPr>
+            <w:tcW w:w="0" w:type="auto"/>
+            <w:hideMark/>
+          </w:tcPr>
+          <w:p>
+            <w:pPr>
+              <w:rPr>
+                <w:rFonts w:ascii="Times New Roman" w:eastAsia="Times New Roman" w:hAnsi="Times New Roman" w:cs="Times New Roman"/>
+                <w:kern w:val="0"/>
+                <w14:ligatures w14:val="none"/>
+              </w:rPr>
+            </w:pPr>
+            <w:r>
+              <w:rPr>
+                <w:rFonts w:ascii="Times New Roman" w:eastAsia="Times New Roman" w:hAnsi="Times New Roman" w:cs="Times New Roman"/>
+                <w:kern w:val="0"/>
+                <w14:ligatures w14:val="none"/>
+              </w:rPr>
+              <w:t>Xác nhận phiếu nhập kho</w:t>
+            </w:r>
+          </w:p>
+        </w:tc>
+        <w:tc>
+          <w:tcPr>
+            <w:tcW w:w="0" w:type="auto"/>
+            <w:hideMark/>
+          </w:tcPr>
+          <w:p>
+            <w:pPr>
+              <w:jc w:val="center"/>
+              <w:rPr>
+                <w:rFonts w:ascii="Times New Roman" w:eastAsia="Times New Roman" w:hAnsi="Times New Roman" w:cs="Times New Roman"/>
+                <w:kern w:val="0"/>
+                <w14:ligatures w14:val="none"/>
+              </w:rPr>
+            </w:pPr>
+            <w:r>
+              <w:rPr>
+                <w:rFonts w:ascii="Times New Roman" w:eastAsia="Times New Roman" w:hAnsi="Times New Roman" w:cs="Times New Roman"/>
+                <w:b/>
+                <w:bCs/>
+                <w:kern w:val="0"/>
+                <w14:ligatures w14:val="none"/>
+              </w:rPr>
+              <w:t>BVA</w:t>
+            </w:r>
+          </w:p>
+        </w:tc>
+        <w:tc>
+          <w:tcPr>
+            <w:tcW w:w="0" w:type="auto"/>
+            <w:hideMark/>
+          </w:tcPr>
+          <w:p>
+            <w:pPr>
+              <w:rPr>
+                <w:rFonts w:ascii="Times New Roman" w:eastAsia="Times New Roman" w:hAnsi="Times New Roman" w:cs="Times New Roman"/>
+                <w:kern w:val="0"/>
+                <w14:ligatures w14:val="none"/>
+              </w:rPr>
+            </w:pPr>
+            <w:r>
+              <w:rPr>
+                <w:rFonts w:ascii="Times New Roman" w:eastAsia="Times New Roman" w:hAnsi="Times New Roman" w:cs="Times New Roman"/>
+                <w:kern w:val="0"/>
+                <w14:ligatures w14:val="none"/>
+              </w:rPr>
+              <w:t>Hoàn thiện thủ tục ghi nhận hàng nhập</w:t>
+            </w:r>
+          </w:p>
+        </w:tc>
+      </w:tr>
+      <w:tr>
+        <w:tc>
+          <w:tcPr>
+            <w:tcW w:w="0" w:type="auto"/>
+            <w:hideMark/>
+          </w:tcPr>
+          <w:p>
+            <w:pPr>
+              <w:jc w:val="right"/>
+              <w:rPr>
+                <w:rFonts w:ascii="Times New Roman" w:eastAsia="Times New Roman" w:hAnsi="Times New Roman" w:cs="Times New Roman"/>
+                <w:kern w:val="0"/>
+                <w14:ligatures w14:val="none"/>
+              </w:rPr>
+            </w:pPr>
+            <w:r>
+              <w:rPr>
+                <w:rFonts w:ascii="Times New Roman" w:eastAsia="Times New Roman" w:hAnsi="Times New Roman" w:cs="Times New Roman"/>
+                <w:kern w:val="0"/>
+                <w14:ligatures w14:val="none"/>
+              </w:rPr>
+              <w:t>13</w:t>
+            </w:r>
+          </w:p>
+        </w:tc>
+        <w:tc>
+          <w:tcPr>
+            <w:tcW w:w="0" w:type="auto"/>
+            <w:hideMark/>
+          </w:tcPr>
+          <w:p>
+            <w:pPr>
+              <w:rPr>
+                <w:rFonts w:ascii="Times New Roman" w:eastAsia="Times New Roman" w:hAnsi="Times New Roman" w:cs="Times New Roman"/>
+                <w:kern w:val="0"/>
+                <w14:ligatures w14:val="none"/>
+              </w:rPr>
+            </w:pPr>
+            <w:r>
+              <w:rPr>
+                <w:rFonts w:ascii="Times New Roman" w:eastAsia="Times New Roman" w:hAnsi="Times New Roman" w:cs="Times New Roman"/>
+                <w:kern w:val="0"/>
+                <w14:ligatures w14:val="none"/>
+              </w:rPr>
+              <w:t>Cập nhật ERP</w:t>
+            </w:r>
+          </w:p>
+        </w:tc>
+        <w:tc>
+          <w:tcPr>
+            <w:tcW w:w="0" w:type="auto"/>
+            <w:hideMark/>
+          </w:tcPr>
+          <w:p>
+            <w:pPr>
+              <w:jc w:val="center"/>
+              <w:rPr>
+                <w:rFonts w:ascii="Times New Roman" w:eastAsia="Times New Roman" w:hAnsi="Times New Roman" w:cs="Times New Roman"/>
+                <w:kern w:val="0"/>
+                <w14:ligatures w14:val="none"/>
+              </w:rPr>
+            </w:pPr>
+            <w:r>
+              <w:rPr>
+                <w:rFonts w:ascii="Times New Roman" w:eastAsia="Times New Roman" w:hAnsi="Times New Roman" w:cs="Times New Roman"/>
+                <w:b/>
+                <w:bCs/>
+                <w:kern w:val="0"/>
+                <w14:ligatures w14:val="none"/>
+              </w:rPr>
+              <w:t>BVA</w:t>
+            </w:r>
+          </w:p>
+        </w:tc>
+        <w:tc>
+          <w:tcPr>
+            <w:tcW w:w="0" w:type="auto"/>
+            <w:hideMark/>
+          </w:tcPr>
+          <w:p>
+            <w:pPr>
+              <w:rPr>
+                <w:rFonts w:ascii="Times New Roman" w:eastAsia="Times New Roman" w:hAnsi="Times New Roman" w:cs="Times New Roman"/>
+                <w:kern w:val="0"/>
+                <w14:ligatures w14:val="none"/>
+              </w:rPr>
+            </w:pPr>
+            <w:r>
+              <w:rPr>
+                <w:rFonts w:ascii="Times New Roman" w:eastAsia="Times New Roman" w:hAnsi="Times New Roman" w:cs="Times New Roman"/>
+                <w:kern w:val="0"/>
+                <w14:ligatures w14:val="none"/>
+              </w:rPr>
+              <w:t>Cập nhật số lượng tồn trên hệ thống</w:t>
+            </w:r>
+          </w:p>
+        </w:tc>
+      </w:tr>
+      <w:tr>
+        <w:tc>
+          <w:tcPr>
+            <w:tcW w:w="0" w:type="auto"/>
+            <w:hideMark/>
+          </w:tcPr>
+          <w:p>
+            <w:pPr>
+              <w:jc w:val="right"/>
+              <w:rPr>
+                <w:rFonts w:ascii="Times New Roman" w:eastAsia="Times New Roman" w:hAnsi="Times New Roman" w:cs="Times New Roman"/>
+                <w:kern w:val="0"/>
+                <w14:ligatures w14:val="none"/>
+              </w:rPr>
+            </w:pPr>
+            <w:r>
+              <w:rPr>
+                <w:rFonts w:ascii="Times New Roman" w:eastAsia="Times New Roman" w:hAnsi="Times New Roman" w:cs="Times New Roman"/>
+                <w:kern w:val="0"/>
+                <w14:ligatures w14:val="none"/>
+              </w:rPr>
+              <w:t>14</w:t>
+            </w:r>
+          </w:p>
+        </w:tc>
+        <w:tc>
+          <w:tcPr>
+            <w:tcW w:w="0" w:type="auto"/>
+            <w:hideMark/>
+          </w:tcPr>
+          <w:p>
+            <w:pPr>
+              <w:rPr>
+                <w:rFonts w:ascii="Times New Roman" w:eastAsia="Times New Roman" w:hAnsi="Times New Roman" w:cs="Times New Roman"/>
+                <w:kern w:val="0"/>
+                <w14:ligatures w14:val="none"/>
+              </w:rPr>
+            </w:pPr>
+            <w:r>
+              <w:rPr>
+                <w:rFonts w:ascii="Times New Roman" w:eastAsia="Times New Roman" w:hAnsi="Times New Roman" w:cs="Times New Roman"/>
+                <w:kern w:val="0"/>
+                <w14:ligatures w14:val="none"/>
+              </w:rPr>
+              <w:t>Đối chiếu chứng từ và thanh toán</w:t>
+            </w:r>
+          </w:p>
+        </w:tc>
+        <w:tc>
+          <w:tcPr>
+            <w:tcW w:w="0" w:type="auto"/>
+            <w:hideMark/>
+          </w:tcPr>
+          <w:p>
+            <w:pPr>
+              <w:jc w:val="center"/>
+              <w:rPr>
+                <w:rFonts w:ascii="Times New Roman" w:eastAsia="Times New Roman" w:hAnsi="Times New Roman" w:cs="Times New Roman"/>
+                <w:kern w:val="0"/>
+                <w14:ligatures w14:val="none"/>
+              </w:rPr>
+            </w:pPr>
+            <w:r>
+              <w:rPr>
+                <w:rFonts w:ascii="Times New Roman" w:eastAsia="Times New Roman" w:hAnsi="Times New Roman" w:cs="Times New Roman"/>
+                <w:b/>
+                <w:bCs/>
+                <w:kern w:val="0"/>
+                <w14:ligatures w14:val="none"/>
+              </w:rPr>
+              <w:t>BVA</w:t>
+            </w:r>
+          </w:p>
+        </w:tc>
+        <w:tc>
+          <w:tcPr>
+            <w:tcW w:w="0" w:type="auto"/>
+            <w:hideMark/>
+          </w:tcPr>
+          <w:p>
+            <w:pPr>
+              <w:rPr>
+                <w:rFonts w:ascii="Times New Roman" w:eastAsia="Times New Roman" w:hAnsi="Times New Roman" w:cs="Times New Roman"/>
+                <w:kern w:val="0"/>
+                <w14:ligatures w14:val="none"/>
+              </w:rPr>
+            </w:pPr>
+            <w:r>
+              <w:rPr>
+                <w:rFonts w:ascii="Times New Roman" w:eastAsia="Times New Roman" w:hAnsi="Times New Roman" w:cs="Times New Roman"/>
+                <w:kern w:val="0"/>
+                <w14:ligatures w14:val="none"/>
+              </w:rPr>
+              <w:t>Cần cho kiểm soát tài chính và thanh toán</w:t>
+            </w:r>
+          </w:p>
+        </w:tc>
+      </w:tr>
+      <w:tr>
+        <w:tc>
+          <w:tcPr>
+            <w:tcW w:w="0" w:type="auto"/>
+            <w:hideMark/>
+          </w:tcPr>
+          <w:p>
+            <w:pPr>
+              <w:jc w:val="right"/>
+              <w:rPr>
+                <w:rFonts w:ascii="Times New Roman" w:eastAsia="Times New Roman" w:hAnsi="Times New Roman" w:cs="Times New Roman"/>
+                <w:kern w:val="0"/>
+                <w14:ligatures w14:val="none"/>
+              </w:rPr>
+            </w:pPr>
+            <w:r>
+              <w:rPr>
+                <w:rFonts w:ascii="Times New Roman" w:eastAsia="Times New Roman" w:hAnsi="Times New Roman" w:cs="Times New Roman"/>
+                <w:kern w:val="0"/>
+                <w14:ligatures w14:val="none"/>
+              </w:rPr>
+              <w:t>15</w:t>
+            </w:r>
+          </w:p>
+        </w:tc>
+        <w:tc>
+          <w:tcPr>
+            <w:tcW w:w="0" w:type="auto"/>
+            <w:hideMark/>
+          </w:tcPr>
+          <w:p>
+            <w:pPr>
+              <w:rPr>
+                <w:rFonts w:ascii="Times New Roman" w:eastAsia="Times New Roman" w:hAnsi="Times New Roman" w:cs="Times New Roman"/>
+                <w:kern w:val="0"/>
+                <w14:ligatures w14:val="none"/>
+              </w:rPr>
+            </w:pPr>
+            <w:r>
+              <w:rPr>
+                <w:rFonts w:ascii="Times New Roman" w:eastAsia="Times New Roman" w:hAnsi="Times New Roman" w:cs="Times New Roman"/>
+                <w:kern w:val="0"/>
+                <w14:ligatures w14:val="none"/>
+              </w:rPr>
+              <w:t>Put-away, đưa hàng vào vị trí lưu kho</w:t>
+            </w:r>
+          </w:p>
+        </w:tc>
+        <w:tc>
+          <w:tcPr>
+            <w:tcW w:w="0" w:type="auto"/>
+            <w:hideMark/>
+          </w:tcPr>
+          <w:p>
+            <w:pPr>
+              <w:jc w:val="center"/>
+              <w:rPr>
+                <w:rFonts w:ascii="Times New Roman" w:eastAsia="Times New Roman" w:hAnsi="Times New Roman" w:cs="Times New Roman"/>
+                <w:kern w:val="0"/>
+                <w14:ligatures w14:val="none"/>
+              </w:rPr>
+            </w:pPr>
+            <w:r>
+              <w:rPr>
+                <w:rFonts w:ascii="Times New Roman" w:eastAsia="Times New Roman" w:hAnsi="Times New Roman" w:cs="Times New Roman"/>
+                <w:b/>
+                <w:bCs/>
+                <w:kern w:val="0"/>
+                <w14:ligatures w14:val="none"/>
+              </w:rPr>
+              <w:t>VA</w:t>
+            </w:r>
+          </w:p>
+        </w:tc>
+        <w:tc>
+          <w:tcPr>
+            <w:tcW w:w="0" w:type="auto"/>
+            <w:hideMark/>
+          </w:tcPr>
+          <w:p>
+            <w:pPr>
+              <w:rPr>
+                <w:rFonts w:ascii="Times New Roman" w:eastAsia="Times New Roman" w:hAnsi="Times New Roman" w:cs="Times New Roman"/>
+                <w:kern w:val="0"/>
+                <w14:ligatures w14:val="none"/>
+              </w:rPr>
+            </w:pPr>
+            <w:r>
+              <w:rPr>
+                <w:rFonts w:ascii="Times New Roman" w:eastAsia="Times New Roman" w:hAnsi="Times New Roman" w:cs="Times New Roman"/>
+                <w:kern w:val="0"/>
+                <w14:ligatures w14:val="none"/>
+              </w:rPr>
+              <w:t>Đưa nguyên liệu vào đúng vị trí và sẵn sàng cấp phát</w:t>
+            </w:r>
+          </w:p>
+        </w:tc>
+      </w:tr>
+      <w:tr>
+        <w:tc>
+          <w:tcPr>
+            <w:tcW w:w="0" w:type="auto"/>
+            <w:hideMark/>
+          </w:tcPr>
+          <w:p>
+            <w:pPr>
+              <w:jc w:val="right"/>
+              <w:rPr>
+                <w:rFonts w:ascii="Times New Roman" w:eastAsia="Times New Roman" w:hAnsi="Times New Roman" w:cs="Times New Roman"/>
+                <w:kern w:val="0"/>
+                <w14:ligatures w14:val="none"/>
+              </w:rPr>
+            </w:pPr>
+            <w:r>
+              <w:rPr>
+                <w:rFonts w:ascii="Times New Roman" w:eastAsia="Times New Roman" w:hAnsi="Times New Roman" w:cs="Times New Roman"/>
+                <w:kern w:val="0"/>
+                <w14:ligatures w14:val="none"/>
+              </w:rPr>
+              <w:t>–</w:t>
+            </w:r>
+          </w:p>
+        </w:tc>
+        <w:tc>
+          <w:tcPr>
+            <w:tcW w:w="0" w:type="auto"/>
+            <w:hideMark/>
+          </w:tcPr>
+          <w:p>
+            <w:pPr>
+              <w:rPr>
+                <w:rFonts w:ascii="Times New Roman" w:eastAsia="Times New Roman" w:hAnsi="Times New Roman" w:cs="Times New Roman"/>
+                <w:kern w:val="0"/>
+                <w14:ligatures w14:val="none"/>
+              </w:rPr>
+            </w:pPr>
+            <w:r>
+              <w:rPr>
+                <w:rFonts w:ascii="Times New Roman" w:eastAsia="Times New Roman" w:hAnsi="Times New Roman" w:cs="Times New Roman"/>
+                <w:kern w:val="0"/>
+                <w14:ligatures w14:val="none"/>
+              </w:rPr>
+              <w:t>Chờ phê duyệt PO</w:t>
+            </w:r>
+          </w:p>
+        </w:tc>
+        <w:tc>
+          <w:tcPr>
+            <w:tcW w:w="0" w:type="auto"/>
+            <w:hideMark/>
+          </w:tcPr>
+          <w:p>
+            <w:pPr>
+              <w:jc w:val="center"/>
+              <w:rPr>
+                <w:rFonts w:ascii="Times New Roman" w:eastAsia="Times New Roman" w:hAnsi="Times New Roman" w:cs="Times New Roman"/>
+                <w:kern w:val="0"/>
+                <w14:ligatures w14:val="none"/>
+              </w:rPr>
+            </w:pPr>
+            <w:r>
+              <w:rPr>
+                <w:rFonts w:ascii="Times New Roman" w:eastAsia="Times New Roman" w:hAnsi="Times New Roman" w:cs="Times New Roman"/>
+                <w:b/>
+                <w:bCs/>
+                <w:kern w:val="0"/>
+                <w14:ligatures w14:val="none"/>
+              </w:rPr>
+              <w:t>NVA</w:t>
+            </w:r>
+          </w:p>
+        </w:tc>
+        <w:tc>
+          <w:tcPr>
+            <w:tcW w:w="0" w:type="auto"/>
+            <w:hideMark/>
+          </w:tcPr>
+          <w:p>
+            <w:pPr>
+              <w:rPr>
+                <w:rFonts w:ascii="Times New Roman" w:eastAsia="Times New Roman" w:hAnsi="Times New Roman" w:cs="Times New Roman"/>
+                <w:kern w:val="0"/>
+                <w14:ligatures w14:val="none"/>
+              </w:rPr>
+            </w:pPr>
+            <w:r>
+              <w:rPr>
+                <w:rFonts w:ascii="Times New Roman" w:eastAsia="Times New Roman" w:hAnsi="Times New Roman" w:cs="Times New Roman"/>
+                <w:kern w:val="0"/>
+                <w14:ligatures w14:val="none"/>
+              </w:rPr>
+              <w:t>Thời gian chờ, không tạo giá trị trực tiếp</w:t>
+            </w:r>
+          </w:p>
+        </w:tc>
+      </w:tr>
+      <w:tr>
+        <w:tc>
+          <w:tcPr>
+            <w:tcW w:w="0" w:type="auto"/>
+            <w:hideMark/>
+          </w:tcPr>
+          <w:p>
+            <w:pPr>
+              <w:jc w:val="right"/>
+              <w:rPr>
+                <w:rFonts w:ascii="Times New Roman" w:eastAsia="Times New Roman" w:hAnsi="Times New Roman" w:cs="Times New Roman"/>
+                <w:kern w:val="0"/>
+                <w14:ligatures w14:val="none"/>
+              </w:rPr>
+            </w:pPr>
+            <w:r>
+              <w:rPr>
+                <w:rFonts w:ascii="Times New Roman" w:eastAsia="Times New Roman" w:hAnsi="Times New Roman" w:cs="Times New Roman"/>
+                <w:kern w:val="0"/>
+                <w14:ligatures w14:val="none"/>
+              </w:rPr>
+              <w:t>–</w:t>
+            </w:r>
+          </w:p>
+        </w:tc>
+        <w:tc>
+          <w:tcPr>
+            <w:tcW w:w="0" w:type="auto"/>
+            <w:hideMark/>
+          </w:tcPr>
+          <w:p>
+            <w:pPr>
+              <w:rPr>
+                <w:rFonts w:ascii="Times New Roman" w:eastAsia="Times New Roman" w:hAnsi="Times New Roman" w:cs="Times New Roman"/>
+                <w:kern w:val="0"/>
+                <w14:ligatures w14:val="none"/>
+              </w:rPr>
+            </w:pPr>
+            <w:r>
+              <w:rPr>
+                <w:rFonts w:ascii="Times New Roman" w:eastAsia="Times New Roman" w:hAnsi="Times New Roman" w:cs="Times New Roman"/>
+                <w:kern w:val="0"/>
+                <w14:ligatures w14:val="none"/>
+              </w:rPr>
+              <w:t>Chờ nhà cung cấp bố trí đơn hàng và lịch giao</w:t>
+            </w:r>
+          </w:p>
+        </w:tc>
+        <w:tc>
+          <w:tcPr>
+            <w:tcW w:w="0" w:type="auto"/>
+            <w:hideMark/>
+          </w:tcPr>
+          <w:p>
+            <w:pPr>
+              <w:jc w:val="center"/>
+              <w:rPr>
+                <w:rFonts w:ascii="Times New Roman" w:eastAsia="Times New Roman" w:hAnsi="Times New Roman" w:cs="Times New Roman"/>
+                <w:kern w:val="0"/>
+                <w14:ligatures w14:val="none"/>
+              </w:rPr>
+            </w:pPr>
+            <w:r>
+              <w:rPr>
+                <w:rFonts w:ascii="Times New Roman" w:eastAsia="Times New Roman" w:hAnsi="Times New Roman" w:cs="Times New Roman"/>
+                <w:b/>
+                <w:bCs/>
+                <w:kern w:val="0"/>
+                <w14:ligatures w14:val="none"/>
+              </w:rPr>
+              <w:t>NVA</w:t>
+            </w:r>
+          </w:p>
+        </w:tc>
+        <w:tc>
+          <w:tcPr>
+            <w:tcW w:w="0" w:type="auto"/>
+            <w:hideMark/>
+          </w:tcPr>
+          <w:p>
+            <w:pPr>
+              <w:rPr>
+                <w:rFonts w:ascii="Times New Roman" w:eastAsia="Times New Roman" w:hAnsi="Times New Roman" w:cs="Times New Roman"/>
+                <w:kern w:val="0"/>
+                <w14:ligatures w14:val="none"/>
+              </w:rPr>
+            </w:pPr>
+            <w:r>
+              <w:rPr>
+                <w:rFonts w:ascii="Times New Roman" w:eastAsia="Times New Roman" w:hAnsi="Times New Roman" w:cs="Times New Roman"/>
+                <w:kern w:val="0"/>
+                <w14:ligatures w14:val="none"/>
+              </w:rPr>
+              <w:t>Làm kéo dài thời gian chu kỳ</w:t>
+            </w:r>
+          </w:p>
+        </w:tc>
+      </w:tr>
+      <w:tr>
+        <w:tc>
+          <w:tcPr>
+            <w:tcW w:w="0" w:type="auto"/>
+            <w:hideMark/>
+          </w:tcPr>
+          <w:p>
+            <w:pPr>
+              <w:jc w:val="right"/>
+              <w:rPr>
+                <w:rFonts w:ascii="Times New Roman" w:eastAsia="Times New Roman" w:hAnsi="Times New Roman" w:cs="Times New Roman"/>
+                <w:kern w:val="0"/>
+                <w14:ligatures w14:val="none"/>
+              </w:rPr>
+            </w:pPr>
+            <w:r>
+              <w:rPr>
+                <w:rFonts w:ascii="Times New Roman" w:eastAsia="Times New Roman" w:hAnsi="Times New Roman" w:cs="Times New Roman"/>
+                <w:kern w:val="0"/>
+                <w14:ligatures w14:val="none"/>
+              </w:rPr>
+              <w:t>–</w:t>
+            </w:r>
+          </w:p>
+        </w:tc>
+        <w:tc>
+          <w:tcPr>
+            <w:tcW w:w="0" w:type="auto"/>
+            <w:hideMark/>
+          </w:tcPr>
+          <w:p>
+            <w:pPr>
+              <w:rPr>
+                <w:rFonts w:ascii="Times New Roman" w:eastAsia="Times New Roman" w:hAnsi="Times New Roman" w:cs="Times New Roman"/>
+                <w:kern w:val="0"/>
+                <w14:ligatures w14:val="none"/>
+              </w:rPr>
+            </w:pPr>
+            <w:r>
+              <w:rPr>
+                <w:rFonts w:ascii="Times New Roman" w:eastAsia="Times New Roman" w:hAnsi="Times New Roman" w:cs="Times New Roman"/>
+                <w:kern w:val="0"/>
+                <w14:ligatures w14:val="none"/>
+              </w:rPr>
+              <w:t>Chờ QC tiếp nhận kiểm tra</w:t>
+            </w:r>
+          </w:p>
+        </w:tc>
+        <w:tc>
+          <w:tcPr>
+            <w:tcW w:w="0" w:type="auto"/>
+            <w:hideMark/>
+          </w:tcPr>
+          <w:p>
+            <w:pPr>
+              <w:jc w:val="center"/>
+              <w:rPr>
+                <w:rFonts w:ascii="Times New Roman" w:eastAsia="Times New Roman" w:hAnsi="Times New Roman" w:cs="Times New Roman"/>
+                <w:kern w:val="0"/>
+                <w14:ligatures w14:val="none"/>
+              </w:rPr>
+            </w:pPr>
+            <w:r>
+              <w:rPr>
+                <w:rFonts w:ascii="Times New Roman" w:eastAsia="Times New Roman" w:hAnsi="Times New Roman" w:cs="Times New Roman"/>
+                <w:b/>
+                <w:bCs/>
+                <w:kern w:val="0"/>
+                <w14:ligatures w14:val="none"/>
+              </w:rPr>
+              <w:t>NVA</w:t>
+            </w:r>
+          </w:p>
+        </w:tc>
+        <w:tc>
+          <w:tcPr>
+            <w:tcW w:w="0" w:type="auto"/>
+            <w:hideMark/>
+          </w:tcPr>
+          <w:p>
+            <w:pPr>
+              <w:rPr>
+                <w:rFonts w:ascii="Times New Roman" w:eastAsia="Times New Roman" w:hAnsi="Times New Roman" w:cs="Times New Roman"/>
+                <w:kern w:val="0"/>
+                <w14:ligatures w14:val="none"/>
+              </w:rPr>
+            </w:pPr>
+            <w:r>
+              <w:rPr>
+                <w:rFonts w:ascii="Times New Roman" w:eastAsia="Times New Roman" w:hAnsi="Times New Roman" w:cs="Times New Roman"/>
+                <w:kern w:val="0"/>
+                <w14:ligatures w14:val="none"/>
+              </w:rPr>
+              <w:t>Hàng chờ nhưng chưa được kiểm tra</w:t>
+            </w:r>
+          </w:p>
+        </w:tc>
+      </w:tr>
+      <w:tr>
+        <w:tc>
+          <w:tcPr>
+            <w:tcW w:w="0" w:type="auto"/>
+            <w:hideMark/>
+          </w:tcPr>
+          <w:p>
+            <w:pPr>
+              <w:jc w:val="right"/>
+              <w:rPr>
+                <w:rFonts w:ascii="Times New Roman" w:eastAsia="Times New Roman" w:hAnsi="Times New Roman" w:cs="Times New Roman"/>
+                <w:kern w:val="0"/>
+                <w14:ligatures w14:val="none"/>
+              </w:rPr>
+            </w:pPr>
+            <w:r>
+              <w:rPr>
+                <w:rFonts w:ascii="Times New Roman" w:eastAsia="Times New Roman" w:hAnsi="Times New Roman" w:cs="Times New Roman"/>
+                <w:kern w:val="0"/>
+                <w14:ligatures w14:val="none"/>
+              </w:rPr>
+              <w:t>–</w:t>
+            </w:r>
+          </w:p>
+        </w:tc>
+        <w:tc>
+          <w:tcPr>
+            <w:tcW w:w="0" w:type="auto"/>
+            <w:hideMark/>
+          </w:tcPr>
+          <w:p>
+            <w:pPr>
+              <w:rPr>
+                <w:rFonts w:ascii="Times New Roman" w:eastAsia="Times New Roman" w:hAnsi="Times New Roman" w:cs="Times New Roman"/>
+                <w:kern w:val="0"/>
+                <w14:ligatures w14:val="none"/>
+              </w:rPr>
+            </w:pPr>
+            <w:r>
+              <w:rPr>
+                <w:rFonts w:ascii="Times New Roman" w:eastAsia="Times New Roman" w:hAnsi="Times New Roman" w:cs="Times New Roman"/>
+                <w:kern w:val="0"/>
+                <w14:ligatures w14:val="none"/>
+              </w:rPr>
+              <w:t>Chờ đối chiếu, hoàn thiện chứng từ</w:t>
+            </w:r>
+          </w:p>
+        </w:tc>
+        <w:tc>
+          <w:tcPr>
+            <w:tcW w:w="0" w:type="auto"/>
+            <w:hideMark/>
+          </w:tcPr>
+          <w:p>
+            <w:pPr>
+              <w:jc w:val="center"/>
+              <w:rPr>
+                <w:rFonts w:ascii="Times New Roman" w:eastAsia="Times New Roman" w:hAnsi="Times New Roman" w:cs="Times New Roman"/>
+                <w:kern w:val="0"/>
+                <w14:ligatures w14:val="none"/>
+              </w:rPr>
+            </w:pPr>
+            <w:r>
+              <w:rPr>
+                <w:rFonts w:ascii="Times New Roman" w:eastAsia="Times New Roman" w:hAnsi="Times New Roman" w:cs="Times New Roman"/>
+                <w:b/>
+                <w:bCs/>
+                <w:kern w:val="0"/>
+                <w14:ligatures w14:val="none"/>
+              </w:rPr>
+              <w:t>NVA</w:t>
+            </w:r>
+          </w:p>
+        </w:tc>
+        <w:tc>
+          <w:tcPr>
+            <w:tcW w:w="0" w:type="auto"/>
+            <w:hideMark/>
+          </w:tcPr>
+          <w:p>
+            <w:pPr>
+              <w:rPr>
+                <w:rFonts w:ascii="Times New Roman" w:eastAsia="Times New Roman" w:hAnsi="Times New Roman" w:cs="Times New Roman"/>
+                <w:kern w:val="0"/>
+                <w14:ligatures w14:val="none"/>
+              </w:rPr>
+            </w:pPr>
+            <w:r>
+              <w:rPr>
+                <w:rFonts w:ascii="Times New Roman" w:eastAsia="Times New Roman" w:hAnsi="Times New Roman" w:cs="Times New Roman"/>
+                <w:kern w:val="0"/>
+                <w14:ligatures w14:val="none"/>
+              </w:rPr>
+              <w:t>Không làm thay đổi trạng thái hay giá trị nguyên liệu</w:t>
             </w:r>
           </w:p>
         </w:tc>
@@ -1919,6 +3567,15 @@
     </w:tbl>
     <w:p>
       <w:pPr>
+        <w:pStyle w:val="NormalWeb"/>
+        <w:ind w:left="1080"/>
+        <w:rPr>
+          <w:color w:val="000000" w:themeColor="text1"/>
+        </w:rPr>
+      </w:pPr>
+    </w:p>
+    <w:p>
+      <w:pPr>
         <w:pStyle w:val="ListParagraph"/>
         <w:ind w:left="1440"/>
         <w:rPr>
@@ -1936,578 +3593,11 @@
     </w:p>
     <w:p>
       <w:pPr>
-        <w:pStyle w:val="Heading4"/>
-        <w:ind w:left="720"/>
-        <w:rPr>
-          <w:b/>
-          <w:bCs/>
-          <w:color w:val="000000" w:themeColor="text1"/>
-        </w:rPr>
-      </w:pPr>
-      <w:r>
-        <w:rPr>
-          <w:b/>
-          <w:bCs/>
-          <w:color w:val="000000" w:themeColor="text1"/>
-        </w:rPr>
-        <w:t>Hoạt động VA</w:t>
-      </w:r>
-    </w:p>
-    <w:p>
-      <w:pPr>
-        <w:pStyle w:val="NormalWeb"/>
-        <w:ind w:left="720"/>
-        <w:rPr>
-          <w:color w:val="000000" w:themeColor="text1"/>
-        </w:rPr>
-      </w:pPr>
-      <w:r>
-        <w:rPr>
-          <w:color w:val="000000" w:themeColor="text1"/>
-        </w:rPr>
-        <w:t>Đây là những hoạt động trực tiếp giúp nguyên liệu được chuẩn bị, kiểm tra và đưa vào trạng thái sẵn sàng sử dụng. Các hoạt động chính gồm:</w:t>
-      </w:r>
-    </w:p>
-    <w:p>
-      <w:pPr>
+        <w:pStyle w:val="ListParagraph"/>
         <w:numPr>
-          <w:ilvl w:val="0"/>
-          <w:numId w:val="87"/>
+          <w:ilvl w:val="1"/>
+          <w:numId w:val="18"/>
         </w:numPr>
-        <w:tabs>
-          <w:tab w:val="clear" w:pos="720"/>
-          <w:tab w:val="num" w:pos="1440"/>
-        </w:tabs>
-        <w:spacing w:before="100" w:beforeAutospacing="1" w:after="100" w:afterAutospacing="1"/>
-        <w:ind w:left="1440"/>
-        <w:rPr>
-          <w:color w:val="000000" w:themeColor="text1"/>
-        </w:rPr>
-      </w:pPr>
-      <w:r>
-        <w:rPr>
-          <w:color w:val="000000" w:themeColor="text1"/>
-        </w:rPr>
-        <w:t>Nhà cung cấp chuẩn bị nguyên liệu.</w:t>
-      </w:r>
-    </w:p>
-    <w:p>
-      <w:pPr>
-        <w:numPr>
-          <w:ilvl w:val="0"/>
-          <w:numId w:val="87"/>
-        </w:numPr>
-        <w:tabs>
-          <w:tab w:val="clear" w:pos="720"/>
-          <w:tab w:val="num" w:pos="1440"/>
-        </w:tabs>
-        <w:spacing w:before="100" w:beforeAutospacing="1" w:after="100" w:afterAutospacing="1"/>
-        <w:ind w:left="1440"/>
-        <w:rPr>
-          <w:color w:val="000000" w:themeColor="text1"/>
-        </w:rPr>
-      </w:pPr>
-      <w:r>
-        <w:rPr>
-          <w:color w:val="000000" w:themeColor="text1"/>
-        </w:rPr>
-        <w:t>Vận chuyển nguyên liệu đến kho.</w:t>
-      </w:r>
-    </w:p>
-    <w:p>
-      <w:pPr>
-        <w:numPr>
-          <w:ilvl w:val="0"/>
-          <w:numId w:val="87"/>
-        </w:numPr>
-        <w:tabs>
-          <w:tab w:val="clear" w:pos="720"/>
-          <w:tab w:val="num" w:pos="1440"/>
-        </w:tabs>
-        <w:spacing w:before="100" w:beforeAutospacing="1" w:after="100" w:afterAutospacing="1"/>
-        <w:ind w:left="1440"/>
-        <w:rPr>
-          <w:color w:val="000000" w:themeColor="text1"/>
-        </w:rPr>
-      </w:pPr>
-      <w:r>
-        <w:rPr>
-          <w:color w:val="000000" w:themeColor="text1"/>
-        </w:rPr>
-        <w:t>Kiểm tra chất lượng nguyên liệu.</w:t>
-      </w:r>
-    </w:p>
-    <w:p>
-      <w:pPr>
-        <w:numPr>
-          <w:ilvl w:val="0"/>
-          <w:numId w:val="87"/>
-        </w:numPr>
-        <w:tabs>
-          <w:tab w:val="clear" w:pos="720"/>
-          <w:tab w:val="num" w:pos="1440"/>
-        </w:tabs>
-        <w:spacing w:before="100" w:beforeAutospacing="1" w:after="100" w:afterAutospacing="1"/>
-        <w:ind w:left="1440"/>
-        <w:rPr>
-          <w:color w:val="000000" w:themeColor="text1"/>
-        </w:rPr>
-      </w:pPr>
-      <w:r>
-        <w:rPr>
-          <w:color w:val="000000" w:themeColor="text1"/>
-        </w:rPr>
-        <w:t>Nhập kho và put-away đúng vị trí.</w:t>
-      </w:r>
-    </w:p>
-    <w:p>
-      <w:pPr>
-        <w:pStyle w:val="NormalWeb"/>
-        <w:ind w:left="720"/>
-        <w:rPr>
-          <w:color w:val="000000" w:themeColor="text1"/>
-        </w:rPr>
-      </w:pPr>
-      <w:r>
-        <w:rPr>
-          <w:color w:val="000000" w:themeColor="text1"/>
-        </w:rPr>
-        <w:t xml:space="preserve">Tổng thời gian VA ước tính là </w:t>
-      </w:r>
-      <w:r>
-        <w:rPr>
-          <w:rStyle w:val="Strong"/>
-          <w:color w:val="000000" w:themeColor="text1"/>
-        </w:rPr>
-        <w:t>810 phút</w:t>
-      </w:r>
-      <w:r>
-        <w:rPr>
-          <w:color w:val="000000" w:themeColor="text1"/>
-        </w:rPr>
-        <w:t xml:space="preserve">, chiếm khoảng </w:t>
-      </w:r>
-      <w:r>
-        <w:rPr>
-          <w:rStyle w:val="Strong"/>
-          <w:color w:val="000000" w:themeColor="text1"/>
-        </w:rPr>
-        <w:t>38% tổng thời gian chu kỳ</w:t>
-      </w:r>
-      <w:r>
-        <w:rPr>
-          <w:color w:val="000000" w:themeColor="text1"/>
-        </w:rPr>
-        <w:t>.</w:t>
-      </w:r>
-    </w:p>
-    <w:p>
-      <w:pPr>
-        <w:pStyle w:val="Heading4"/>
-        <w:ind w:left="720"/>
-        <w:rPr>
-          <w:b/>
-          <w:bCs/>
-          <w:color w:val="000000" w:themeColor="text1"/>
-        </w:rPr>
-      </w:pPr>
-      <w:r>
-        <w:rPr>
-          <w:b/>
-          <w:bCs/>
-          <w:color w:val="000000" w:themeColor="text1"/>
-        </w:rPr>
-        <w:t>Hoạt động BVA</w:t>
-      </w:r>
-    </w:p>
-    <w:p>
-      <w:pPr>
-        <w:pStyle w:val="NormalWeb"/>
-        <w:ind w:left="720"/>
-        <w:rPr>
-          <w:color w:val="000000" w:themeColor="text1"/>
-        </w:rPr>
-      </w:pPr>
-      <w:r>
-        <w:rPr>
-          <w:color w:val="000000" w:themeColor="text1"/>
-        </w:rPr>
-        <w:t>Các hoạt động này không trực tiếp làm thay đổi nguyên liệu nhưng cần thiết để kiểm soát tài chính, chất lượng, truy xuất và tuân thủ quy trình:</w:t>
-      </w:r>
-    </w:p>
-    <w:p>
-      <w:pPr>
-        <w:numPr>
-          <w:ilvl w:val="0"/>
-          <w:numId w:val="88"/>
-        </w:numPr>
-        <w:tabs>
-          <w:tab w:val="clear" w:pos="720"/>
-          <w:tab w:val="num" w:pos="1440"/>
-        </w:tabs>
-        <w:spacing w:before="100" w:beforeAutospacing="1" w:after="100" w:afterAutospacing="1"/>
-        <w:ind w:left="1440"/>
-        <w:rPr>
-          <w:color w:val="000000" w:themeColor="text1"/>
-        </w:rPr>
-      </w:pPr>
-      <w:r>
-        <w:rPr>
-          <w:color w:val="000000" w:themeColor="text1"/>
-        </w:rPr>
-        <w:t>Kiểm tra tồn kho và lập yêu cầu mua.</w:t>
-      </w:r>
-    </w:p>
-    <w:p>
-      <w:pPr>
-        <w:numPr>
-          <w:ilvl w:val="0"/>
-          <w:numId w:val="88"/>
-        </w:numPr>
-        <w:tabs>
-          <w:tab w:val="clear" w:pos="720"/>
-          <w:tab w:val="num" w:pos="1440"/>
-        </w:tabs>
-        <w:spacing w:before="100" w:beforeAutospacing="1" w:after="100" w:afterAutospacing="1"/>
-        <w:ind w:left="1440"/>
-        <w:rPr>
-          <w:color w:val="000000" w:themeColor="text1"/>
-        </w:rPr>
-      </w:pPr>
-      <w:r>
-        <w:rPr>
-          <w:color w:val="000000" w:themeColor="text1"/>
-        </w:rPr>
-        <w:t>Lập, duyệt và phát hành PO.</w:t>
-      </w:r>
-    </w:p>
-    <w:p>
-      <w:pPr>
-        <w:numPr>
-          <w:ilvl w:val="0"/>
-          <w:numId w:val="88"/>
-        </w:numPr>
-        <w:tabs>
-          <w:tab w:val="clear" w:pos="720"/>
-          <w:tab w:val="num" w:pos="1440"/>
-        </w:tabs>
-        <w:spacing w:before="100" w:beforeAutospacing="1" w:after="100" w:afterAutospacing="1"/>
-        <w:ind w:left="1440"/>
-        <w:rPr>
-          <w:color w:val="000000" w:themeColor="text1"/>
-        </w:rPr>
-      </w:pPr>
-      <w:r>
-        <w:rPr>
-          <w:color w:val="000000" w:themeColor="text1"/>
-        </w:rPr>
-        <w:t>Kiểm tra nhà cung cấp.</w:t>
-      </w:r>
-    </w:p>
-    <w:p>
-      <w:pPr>
-        <w:numPr>
-          <w:ilvl w:val="0"/>
-          <w:numId w:val="88"/>
-        </w:numPr>
-        <w:tabs>
-          <w:tab w:val="clear" w:pos="720"/>
-          <w:tab w:val="num" w:pos="1440"/>
-        </w:tabs>
-        <w:spacing w:before="100" w:beforeAutospacing="1" w:after="100" w:afterAutospacing="1"/>
-        <w:ind w:left="1440"/>
-        <w:rPr>
-          <w:color w:val="000000" w:themeColor="text1"/>
-        </w:rPr>
-      </w:pPr>
-      <w:r>
-        <w:rPr>
-          <w:color w:val="000000" w:themeColor="text1"/>
-        </w:rPr>
-        <w:t>Đối chiếu hàng hóa và chứng từ.</w:t>
-      </w:r>
-    </w:p>
-    <w:p>
-      <w:pPr>
-        <w:numPr>
-          <w:ilvl w:val="0"/>
-          <w:numId w:val="88"/>
-        </w:numPr>
-        <w:tabs>
-          <w:tab w:val="clear" w:pos="720"/>
-          <w:tab w:val="num" w:pos="1440"/>
-        </w:tabs>
-        <w:spacing w:before="100" w:beforeAutospacing="1" w:after="100" w:afterAutospacing="1"/>
-        <w:ind w:left="1440"/>
-        <w:rPr>
-          <w:color w:val="000000" w:themeColor="text1"/>
-        </w:rPr>
-      </w:pPr>
-      <w:r>
-        <w:rPr>
-          <w:color w:val="000000" w:themeColor="text1"/>
-        </w:rPr>
-        <w:t>Tạo phiếu nhập kho.</w:t>
-      </w:r>
-    </w:p>
-    <w:p>
-      <w:pPr>
-        <w:numPr>
-          <w:ilvl w:val="0"/>
-          <w:numId w:val="88"/>
-        </w:numPr>
-        <w:tabs>
-          <w:tab w:val="clear" w:pos="720"/>
-          <w:tab w:val="num" w:pos="1440"/>
-        </w:tabs>
-        <w:spacing w:before="100" w:beforeAutospacing="1" w:after="100" w:afterAutospacing="1"/>
-        <w:ind w:left="1440"/>
-        <w:rPr>
-          <w:color w:val="000000" w:themeColor="text1"/>
-        </w:rPr>
-      </w:pPr>
-      <w:r>
-        <w:rPr>
-          <w:color w:val="000000" w:themeColor="text1"/>
-        </w:rPr>
-        <w:t>Cập nhật ERP.</w:t>
-      </w:r>
-    </w:p>
-    <w:p>
-      <w:pPr>
-        <w:numPr>
-          <w:ilvl w:val="0"/>
-          <w:numId w:val="88"/>
-        </w:numPr>
-        <w:tabs>
-          <w:tab w:val="clear" w:pos="720"/>
-          <w:tab w:val="num" w:pos="1440"/>
-        </w:tabs>
-        <w:spacing w:before="100" w:beforeAutospacing="1" w:after="100" w:afterAutospacing="1"/>
-        <w:ind w:left="1440"/>
-        <w:rPr>
-          <w:color w:val="000000" w:themeColor="text1"/>
-        </w:rPr>
-      </w:pPr>
-      <w:r>
-        <w:rPr>
-          <w:color w:val="000000" w:themeColor="text1"/>
-        </w:rPr>
-        <w:t>Đối chiếu hóa đơn và thanh toán.</w:t>
-      </w:r>
-    </w:p>
-    <w:p>
-      <w:pPr>
-        <w:pStyle w:val="NormalWeb"/>
-        <w:ind w:left="720"/>
-        <w:rPr>
-          <w:color w:val="000000" w:themeColor="text1"/>
-        </w:rPr>
-      </w:pPr>
-      <w:r>
-        <w:rPr>
-          <w:color w:val="000000" w:themeColor="text1"/>
-        </w:rPr>
-        <w:t xml:space="preserve">Tổng thời gian BVA là khoảng </w:t>
-      </w:r>
-      <w:r>
-        <w:rPr>
-          <w:rStyle w:val="Strong"/>
-          <w:color w:val="000000" w:themeColor="text1"/>
-        </w:rPr>
-        <w:t>240 phút</w:t>
-      </w:r>
-      <w:r>
-        <w:rPr>
-          <w:color w:val="000000" w:themeColor="text1"/>
-        </w:rPr>
-        <w:t xml:space="preserve">, chiếm </w:t>
-      </w:r>
-      <w:r>
-        <w:rPr>
-          <w:rStyle w:val="Strong"/>
-          <w:color w:val="000000" w:themeColor="text1"/>
-        </w:rPr>
-        <w:t>11,3% tổng thời gian chu kỳ</w:t>
-      </w:r>
-      <w:r>
-        <w:rPr>
-          <w:color w:val="000000" w:themeColor="text1"/>
-        </w:rPr>
-        <w:t>.</w:t>
-      </w:r>
-    </w:p>
-    <w:p>
-      <w:pPr>
-        <w:pStyle w:val="Heading4"/>
-        <w:ind w:left="720"/>
-        <w:rPr>
-          <w:b/>
-          <w:bCs/>
-          <w:color w:val="000000" w:themeColor="text1"/>
-        </w:rPr>
-      </w:pPr>
-      <w:r>
-        <w:rPr>
-          <w:b/>
-          <w:bCs/>
-          <w:color w:val="000000" w:themeColor="text1"/>
-        </w:rPr>
-        <w:t>Hoạt động NVA</w:t>
-      </w:r>
-    </w:p>
-    <w:p>
-      <w:pPr>
-        <w:pStyle w:val="NormalWeb"/>
-        <w:ind w:left="720"/>
-        <w:rPr>
-          <w:color w:val="000000" w:themeColor="text1"/>
-        </w:rPr>
-      </w:pPr>
-      <w:r>
-        <w:rPr>
-          <w:color w:val="000000" w:themeColor="text1"/>
-        </w:rPr>
-        <w:t>Hoạt động NVA chủ yếu là thời gian chờ giữa các bộ phận:</w:t>
-      </w:r>
-    </w:p>
-    <w:p>
-      <w:pPr>
-        <w:numPr>
-          <w:ilvl w:val="0"/>
-          <w:numId w:val="89"/>
-        </w:numPr>
-        <w:tabs>
-          <w:tab w:val="clear" w:pos="720"/>
-          <w:tab w:val="num" w:pos="1440"/>
-        </w:tabs>
-        <w:spacing w:before="100" w:beforeAutospacing="1" w:after="100" w:afterAutospacing="1"/>
-        <w:ind w:left="1440"/>
-        <w:rPr>
-          <w:color w:val="000000" w:themeColor="text1"/>
-        </w:rPr>
-      </w:pPr>
-      <w:r>
-        <w:rPr>
-          <w:color w:val="000000" w:themeColor="text1"/>
-        </w:rPr>
-        <w:t>Chờ PO được phê duyệt.</w:t>
-      </w:r>
-    </w:p>
-    <w:p>
-      <w:pPr>
-        <w:numPr>
-          <w:ilvl w:val="0"/>
-          <w:numId w:val="89"/>
-        </w:numPr>
-        <w:tabs>
-          <w:tab w:val="clear" w:pos="720"/>
-          <w:tab w:val="num" w:pos="1440"/>
-        </w:tabs>
-        <w:spacing w:before="100" w:beforeAutospacing="1" w:after="100" w:afterAutospacing="1"/>
-        <w:ind w:left="1440"/>
-        <w:rPr>
-          <w:color w:val="000000" w:themeColor="text1"/>
-        </w:rPr>
-      </w:pPr>
-      <w:r>
-        <w:rPr>
-          <w:color w:val="000000" w:themeColor="text1"/>
-        </w:rPr>
-        <w:t>Chờ nhà cung cấp chuẩn bị và bố trí giao hàng.</w:t>
-      </w:r>
-    </w:p>
-    <w:p>
-      <w:pPr>
-        <w:numPr>
-          <w:ilvl w:val="0"/>
-          <w:numId w:val="89"/>
-        </w:numPr>
-        <w:tabs>
-          <w:tab w:val="clear" w:pos="720"/>
-          <w:tab w:val="num" w:pos="1440"/>
-        </w:tabs>
-        <w:spacing w:before="100" w:beforeAutospacing="1" w:after="100" w:afterAutospacing="1"/>
-        <w:ind w:left="1440"/>
-        <w:rPr>
-          <w:color w:val="000000" w:themeColor="text1"/>
-        </w:rPr>
-      </w:pPr>
-      <w:r>
-        <w:rPr>
-          <w:color w:val="000000" w:themeColor="text1"/>
-        </w:rPr>
-        <w:t>Chờ QC tiếp nhận mẫu kiểm tra.</w:t>
-      </w:r>
-    </w:p>
-    <w:p>
-      <w:pPr>
-        <w:numPr>
-          <w:ilvl w:val="0"/>
-          <w:numId w:val="89"/>
-        </w:numPr>
-        <w:tabs>
-          <w:tab w:val="clear" w:pos="720"/>
-          <w:tab w:val="num" w:pos="1440"/>
-        </w:tabs>
-        <w:spacing w:before="100" w:beforeAutospacing="1" w:after="100" w:afterAutospacing="1"/>
-        <w:ind w:left="1440"/>
-        <w:rPr>
-          <w:color w:val="000000" w:themeColor="text1"/>
-        </w:rPr>
-      </w:pPr>
-      <w:r>
-        <w:rPr>
-          <w:color w:val="000000" w:themeColor="text1"/>
-        </w:rPr>
-        <w:t>Chờ hoàn thiện và đối chiếu chứng từ.</w:t>
-      </w:r>
-    </w:p>
-    <w:p>
-      <w:pPr>
-        <w:pStyle w:val="NormalWeb"/>
-        <w:ind w:left="720"/>
-        <w:rPr>
-          <w:color w:val="000000" w:themeColor="text1"/>
-        </w:rPr>
-      </w:pPr>
-      <w:r>
-        <w:rPr>
-          <w:color w:val="000000" w:themeColor="text1"/>
-        </w:rPr>
-        <w:t xml:space="preserve">Tổng thời gian NVA ước tính là </w:t>
-      </w:r>
-      <w:r>
-        <w:rPr>
-          <w:rStyle w:val="Strong"/>
-          <w:color w:val="000000" w:themeColor="text1"/>
-        </w:rPr>
-        <w:t>1.080 phút</w:t>
-      </w:r>
-      <w:r>
-        <w:rPr>
-          <w:color w:val="000000" w:themeColor="text1"/>
-        </w:rPr>
-        <w:t xml:space="preserve">, chiếm </w:t>
-      </w:r>
-      <w:r>
-        <w:rPr>
-          <w:rStyle w:val="Strong"/>
-          <w:color w:val="000000" w:themeColor="text1"/>
-        </w:rPr>
-        <w:t>50,7% tổng thời gian chu kỳ</w:t>
-      </w:r>
-      <w:r>
-        <w:rPr>
-          <w:color w:val="000000" w:themeColor="text1"/>
-        </w:rPr>
-        <w:t>. Đây là nhóm cần ưu tiên cải tiến.</w:t>
-      </w:r>
-    </w:p>
-    <w:p>
-      <w:pPr>
-        <w:pStyle w:val="ListParagraph"/>
-        <w:ind w:left="1440"/>
         <w:rPr>
           <w:rFonts w:ascii="Times New Roman" w:eastAsia="Times New Roman" w:hAnsi="Times New Roman" w:cs="Times New Roman"/>
           <w:b/>
@@ -2520,26 +3610,6 @@
           <w14:ligatures w14:val="none"/>
         </w:rPr>
       </w:pPr>
-    </w:p>
-    <w:p>
-      <w:pPr>
-        <w:pStyle w:val="ListParagraph"/>
-        <w:numPr>
-          <w:ilvl w:val="1"/>
-          <w:numId w:val="18"/>
-        </w:numPr>
-        <w:rPr>
-          <w:rFonts w:ascii="Times New Roman" w:eastAsia="Times New Roman" w:hAnsi="Times New Roman" w:cs="Times New Roman"/>
-          <w:b/>
-          <w:bCs/>
-          <w:color w:val="000000" w:themeColor="text1"/>
-          <w:kern w:val="0"/>
-          <w:sz w:val="26"/>
-          <w:szCs w:val="26"/>
-          <w:lang w:val="vi-VN"/>
-          <w14:ligatures w14:val="none"/>
-        </w:rPr>
-      </w:pPr>
       <w:r>
         <w:rPr>
           <w:rFonts w:ascii="Times New Roman" w:hAnsi="Times New Roman" w:cs="Times New Roman"/>
@@ -2680,6 +3750,7 @@
           <w:rStyle w:val="Strong"/>
           <w:color w:val="000000" w:themeColor="text1"/>
         </w:rPr>
+        <w:lastRenderedPageBreak/>
         <w:t>Lãng phí tồn kho:</w:t>
       </w:r>
       <w:r>
@@ -2965,6 +4036,28 @@
         <w:t xml:space="preserve"> và không phát sinh sai lệch.</w:t>
       </w:r>
     </w:p>
+    <w:p>
+      <w:pPr>
+        <w:pStyle w:val="NormalWeb"/>
+        <w:ind w:firstLine="720"/>
+        <w:rPr>
+          <w:b/>
+          <w:bCs/>
+          <w:color w:val="000000" w:themeColor="text1"/>
+          <w:sz w:val="26"/>
+          <w:szCs w:val="26"/>
+        </w:rPr>
+      </w:pPr>
+      <w:r>
+        <w:rPr>
+          <w:rStyle w:val="Strong"/>
+          <w:color w:val="000000" w:themeColor="text1"/>
+          <w:sz w:val="26"/>
+          <w:szCs w:val="26"/>
+        </w:rPr>
+        <w:t>Thời gian xử lý</w:t>
+      </w:r>
+    </w:p>
     <w:tbl>
       <w:tblPr>
         <w:tblStyle w:val="TableGrid"/>
@@ -3000,7 +4093,6 @@
                 <w:bCs/>
                 <w:color w:val="000000" w:themeColor="text1"/>
               </w:rPr>
-              <w:lastRenderedPageBreak/>
               <w:t>Hoạt động</w:t>
             </w:r>
           </w:p>
@@ -3307,6 +4399,7 @@
               <w:rPr>
                 <w:color w:val="000000" w:themeColor="text1"/>
               </w:rPr>
+              <w:lastRenderedPageBreak/>
               <w:t>Nhà cung cấp chuẩn bị hàng</w:t>
             </w:r>
           </w:p>
@@ -3711,30 +4804,39 @@
         <w:pStyle w:val="Heading4"/>
         <w:ind w:left="720"/>
         <w:rPr>
+          <w:rFonts w:ascii="Times New Roman" w:hAnsi="Times New Roman" w:cs="Times New Roman"/>
           <w:b/>
           <w:bCs/>
           <w:i w:val="0"/>
           <w:iCs w:val="0"/>
           <w:color w:val="000000" w:themeColor="text1"/>
+          <w:sz w:val="26"/>
+          <w:szCs w:val="26"/>
         </w:rPr>
       </w:pPr>
       <w:r>
         <w:rPr>
+          <w:rFonts w:ascii="Times New Roman" w:hAnsi="Times New Roman" w:cs="Times New Roman"/>
           <w:b/>
           <w:bCs/>
           <w:i w:val="0"/>
           <w:iCs w:val="0"/>
           <w:color w:val="000000" w:themeColor="text1"/>
+          <w:sz w:val="26"/>
+          <w:szCs w:val="26"/>
         </w:rPr>
         <w:t>Thời gian chờ</w:t>
       </w:r>
       <w:r>
         <w:rPr>
+          <w:rFonts w:ascii="Times New Roman" w:hAnsi="Times New Roman" w:cs="Times New Roman"/>
           <w:b/>
           <w:bCs/>
           <w:i w:val="0"/>
           <w:iCs w:val="0"/>
           <w:color w:val="000000" w:themeColor="text1"/>
+          <w:sz w:val="26"/>
+          <w:szCs w:val="26"/>
         </w:rPr>
         <w:tab/>
       </w:r>
@@ -4134,15 +5236,6 @@
           </m:r>
         </m:oMath>
       </m:oMathPara>
-    </w:p>
-    <w:p>
-      <w:pPr>
-        <w:pStyle w:val="NormalWeb"/>
-        <w:ind w:left="720"/>
-        <w:rPr>
-          <w:color w:val="000000" w:themeColor="text1"/>
-        </w:rPr>
-      </w:pPr>
     </w:p>
     <w:p>
       <w:pPr>
@@ -4344,15 +5437,6 @@
           </m:r>
         </m:oMath>
       </m:oMathPara>
-    </w:p>
-    <w:p>
-      <w:pPr>
-        <w:pStyle w:val="NormalWeb"/>
-        <w:ind w:left="1440"/>
-        <w:rPr>
-          <w:color w:val="000000" w:themeColor="text1"/>
-        </w:rPr>
-      </w:pPr>
     </w:p>
     <w:p>
       <w:pPr>
@@ -4716,76 +5800,6 @@
     <w:p>
       <w:pPr>
         <w:pStyle w:val="NormalWeb"/>
-        <w:ind w:left="1080"/>
-        <w:rPr>
-          <w:color w:val="000000" w:themeColor="text1"/>
-        </w:rPr>
-      </w:pPr>
-    </w:p>
-    <w:p>
-      <w:pPr>
-        <w:pStyle w:val="NormalWeb"/>
-        <w:ind w:left="1080"/>
-        <w:rPr>
-          <w:color w:val="000000" w:themeColor="text1"/>
-        </w:rPr>
-      </w:pPr>
-      <m:oMathPara>
-        <m:oMath>
-          <m:r>
-            <m:rPr>
-              <m:sty m:val="p"/>
-            </m:rPr>
-            <w:rPr>
-              <w:rFonts w:ascii="Cambria Math" w:hAnsi="Cambria Math"/>
-              <w:color w:val="000000" w:themeColor="text1"/>
-            </w:rPr>
-            <w:br/>
-          </m:r>
-        </m:oMath>
-        <m:oMath>
-          <m:r>
-            <w:rPr>
-              <w:rFonts w:ascii="Cambria Math" w:hAnsi="Cambria Math"/>
-              <w:color w:val="000000" w:themeColor="text1"/>
-            </w:rPr>
-            <m:t xml:space="preserve"> </m:t>
-          </m:r>
-          <w:sdt>
-            <w:sdtPr>
-              <w:rPr>
-                <w:rFonts w:ascii="Cambria Math" w:hAnsi="Cambria Math"/>
-                <w:i/>
-                <w:color w:val="000000" w:themeColor="text1"/>
-              </w:rPr>
-              <w:id w:val="1658951984"/>
-              <w:placeholder>
-                <w:docPart w:val="DefaultPlaceholder_2098659788"/>
-              </w:placeholder>
-              <w:temporary/>
-              <w:showingPlcHdr/>
-              <w:equation/>
-            </w:sdtPr>
-            <w:sdtContent>
-              <m:r>
-                <m:rPr>
-                  <m:sty m:val="p"/>
-                </m:rPr>
-                <w:rPr>
-                  <w:rStyle w:val="PlaceholderText"/>
-                  <w:rFonts w:ascii="Cambria Math" w:hAnsi="Cambria Math"/>
-                  <w:color w:val="000000" w:themeColor="text1"/>
-                </w:rPr>
-                <m:t>Type equation here.</m:t>
-              </m:r>
-            </w:sdtContent>
-          </w:sdt>
-        </m:oMath>
-      </m:oMathPara>
-    </w:p>
-    <w:p>
-      <w:pPr>
-        <w:pStyle w:val="NormalWeb"/>
         <w:ind w:left="720"/>
         <w:rPr>
           <w:color w:val="000000" w:themeColor="text1"/>
@@ -4795,6 +5809,7 @@
         <w:rPr>
           <w:color w:val="000000" w:themeColor="text1"/>
         </w:rPr>
+        <w:lastRenderedPageBreak/>
         <w:t xml:space="preserve">Như vậy, hoạt động xử lý thực tế chiếm </w:t>
       </w:r>
       <w:r>
@@ -5706,7 +6721,6 @@
         <w:rPr>
           <w:color w:val="000000" w:themeColor="text1"/>
         </w:rPr>
-        <w:lastRenderedPageBreak/>
         <w:t>Chi phí thời gian chờ</w:t>
       </w:r>
     </w:p>
@@ -5895,6 +6909,7 @@
         <w:rPr>
           <w:color w:val="000000" w:themeColor="text1"/>
         </w:rPr>
+        <w:lastRenderedPageBreak/>
         <w:t>Tổng chi phí quy trình</w:t>
       </w:r>
     </w:p>
@@ -7052,6 +8067,7 @@
         <w:rPr>
           <w:color w:val="000000" w:themeColor="text1"/>
         </w:rPr>
+        <w:lastRenderedPageBreak/>
         <w:t>Doanh nghiệp có thể giảm chi phí bằng cách:</w:t>
       </w:r>
     </w:p>
@@ -20590,579 +21606,6 @@
 </w:styles>
 </file>
 
-<file path=word/glossary/document.xml><?xml version="1.0" encoding="utf-8"?>
-<w:glossaryDocument xmlns:wpc="http://schemas.microsoft.com/office/word/2010/wordprocessingCanvas" xmlns:cx="http://schemas.microsoft.com/office/drawing/2014/chartex" xmlns:cx1="http://schemas.microsoft.com/office/drawing/2015/9/8/chartex" xmlns:cx2="http://schemas.microsoft.com/office/drawing/2015/10/21/chartex" xmlns:cx3="http://schemas.microsoft.com/office/drawing/2016/5/9/chartex" xmlns:cx4="http://schemas.microsoft.com/office/drawing/2016/5/10/chartex" xmlns:cx5="http://schemas.microsoft.com/office/drawing/2016/5/11/chartex" xmlns:cx6="http://schemas.microsoft.com/office/drawing/2016/5/12/chartex" xmlns:cx7="http://schemas.microsoft.com/office/drawing/2016/5/13/chartex" xmlns:cx8="http://schemas.microsoft.com/office/drawing/2016/5/14/chartex" xmlns:mc="http://schemas.openxmlformats.org/markup-compatibility/2006" xmlns:aink="http://schemas.microsoft.com/office/drawing/2016/ink" xmlns:am3d="http://schemas.microsoft.com/office/drawing/2017/model3d" xmlns:o="urn:schemas-microsoft-com:office:office" xmlns:oel="http://schemas.microsoft.com/office/2019/extlst" xmlns:r="http://schemas.openxmlformats.org/officeDocument/2006/relationships" xmlns:m="http://schemas.openxmlformats.org/officeDocument/2006/math" xmlns:v="urn:schemas-microsoft-com:vml" xmlns:wp14="http://schemas.microsoft.com/office/word/2010/wordprocessingDrawing" xmlns:wp="http://schemas.openxmlformats.org/drawingml/2006/wordprocessingDrawing" xmlns:w10="urn:schemas-microsoft-com:office:word" xmlns:w="http://schemas.openxmlformats.org/wordprocessingml/2006/main" xmlns:w14="http://schemas.microsoft.com/office/word/2010/wordml" xmlns:w15="http://schemas.microsoft.com/office/word/2012/wordml" xmlns:w16cex="http://schemas.microsoft.com/office/word/2018/wordml/cex" xmlns:w16cid="http://schemas.microsoft.com/office/word/2016/wordml/cid" xmlns:w16="http://schemas.microsoft.com/office/word/2018/wordml" xmlns:w16sdtdh="http://schemas.microsoft.com/office/word/2020/wordml/sdtdatahash" xmlns:w16se="http://schemas.microsoft.com/office/word/2015/wordml/symex" xmlns:wpg="http://schemas.microsoft.com/office/word/2010/wordprocessingGroup" xmlns:wpi="http://schemas.microsoft.com/office/word/2010/wordprocessingInk" xmlns:wne="http://schemas.microsoft.com/office/word/2006/wordml" xmlns:wps="http://schemas.microsoft.com/office/word/2010/wordprocessingShape" mc:Ignorable="w14 w15 w16se w16cid w16 w16cex w16sdtdh wp14">
-  <w:docParts>
-    <w:docPart>
-      <w:docPartPr>
-        <w:name w:val="DefaultPlaceholder_2098659788"/>
-        <w:category>
-          <w:name w:val="General"/>
-          <w:gallery w:val="placeholder"/>
-        </w:category>
-        <w:types>
-          <w:type w:val="bbPlcHdr"/>
-        </w:types>
-        <w:behaviors>
-          <w:behavior w:val="content"/>
-        </w:behaviors>
-        <w:guid w:val="{FACFC91D-6FEC-CF41-9FBA-2E5F7451C828}"/>
-      </w:docPartPr>
-      <w:docPartBody>
-        <w:p>
-          <w:r>
-            <w:rPr>
-              <w:rStyle w:val="PlaceholderText"/>
-            </w:rPr>
-            <w:t>Type equation here.</w:t>
-          </w:r>
-        </w:p>
-      </w:docPartBody>
-    </w:docPart>
-  </w:docParts>
-</w:glossaryDocument>
-</file>
-
-<file path=word/glossary/fontTable.xml><?xml version="1.0" encoding="utf-8"?>
-<w:fonts xmlns:mc="http://schemas.openxmlformats.org/markup-compatibility/2006" xmlns:r="http://schemas.openxmlformats.org/officeDocument/2006/relationships" xmlns:w="http://schemas.openxmlformats.org/wordprocessingml/2006/main" xmlns:w14="http://schemas.microsoft.com/office/word/2010/wordml" xmlns:w15="http://schemas.microsoft.com/office/word/2012/wordml" xmlns:w16cex="http://schemas.microsoft.com/office/word/2018/wordml/cex" xmlns:w16cid="http://schemas.microsoft.com/office/word/2016/wordml/cid" xmlns:w16="http://schemas.microsoft.com/office/word/2018/wordml" xmlns:w16sdtdh="http://schemas.microsoft.com/office/word/2020/wordml/sdtdatahash" xmlns:w16se="http://schemas.microsoft.com/office/word/2015/wordml/symex" mc:Ignorable="w14 w15 w16se w16cid w16 w16cex w16sdtdh">
-  <w:font w:name="Symbol">
-    <w:panose1 w:val="05050102010706020507"/>
-    <w:charset w:val="02"/>
-    <w:family w:val="decorative"/>
-    <w:pitch w:val="variable"/>
-    <w:sig w:usb0="00000003" w:usb1="10000000" w:usb2="00000000" w:usb3="00000000" w:csb0="80000001" w:csb1="00000000"/>
-  </w:font>
-  <w:font w:name="Times New Roman">
-    <w:panose1 w:val="02020603050405020304"/>
-    <w:charset w:val="00"/>
-    <w:family w:val="roman"/>
-    <w:pitch w:val="variable"/>
-    <w:sig w:usb0="E0002EFF" w:usb1="C000785B" w:usb2="00000009" w:usb3="00000000" w:csb0="000001FF" w:csb1="00000000"/>
-  </w:font>
-  <w:font w:name="Courier New">
-    <w:panose1 w:val="02070309020205020404"/>
-    <w:charset w:val="00"/>
-    <w:family w:val="modern"/>
-    <w:pitch w:val="fixed"/>
-    <w:sig w:usb0="E0002EFF" w:usb1="C0007843" w:usb2="00000009" w:usb3="00000000" w:csb0="000001FF" w:csb1="00000000"/>
-  </w:font>
-  <w:font w:name="Wingdings">
-    <w:panose1 w:val="05000000000000000000"/>
-    <w:charset w:val="4D"/>
-    <w:family w:val="decorative"/>
-    <w:pitch w:val="variable"/>
-    <w:sig w:usb0="00000003" w:usb1="00000000" w:usb2="00000000" w:usb3="00000000" w:csb0="80000001" w:csb1="00000000"/>
-  </w:font>
-  <w:font w:name="Calibri">
-    <w:panose1 w:val="020F0502020204030204"/>
-    <w:charset w:val="00"/>
-    <w:family w:val="swiss"/>
-    <w:pitch w:val="variable"/>
-    <w:sig w:usb0="E0002AFF" w:usb1="C000247B" w:usb2="00000009" w:usb3="00000000" w:csb0="000001FF" w:csb1="00000000"/>
-  </w:font>
-  <w:font w:name="Calibri Light">
-    <w:panose1 w:val="020F0302020204030204"/>
-    <w:charset w:val="00"/>
-    <w:family w:val="swiss"/>
-    <w:pitch w:val="variable"/>
-    <w:sig w:usb0="E4002EFF" w:usb1="C200247B" w:usb2="00000009" w:usb3="00000000" w:csb0="000001FF" w:csb1="00000000"/>
-  </w:font>
-  <w:font w:name="Cambria Math">
-    <w:panose1 w:val="02040503050406030204"/>
-    <w:charset w:val="00"/>
-    <w:family w:val="roman"/>
-    <w:pitch w:val="variable"/>
-    <w:sig w:usb0="E00002FF" w:usb1="420024FF" w:usb2="00000000" w:usb3="00000000" w:csb0="0000019F" w:csb1="00000000"/>
-  </w:font>
-</w:fonts>
-</file>
-
-<file path=word/glossary/settings.xml><?xml version="1.0" encoding="utf-8"?>
-<w:settings xmlns:mc="http://schemas.openxmlformats.org/markup-compatibility/2006" xmlns:o="urn:schemas-microsoft-com:office:office" xmlns:r="http://schemas.openxmlformats.org/officeDocument/2006/relationships" xmlns:m="http://schemas.openxmlformats.org/officeDocument/2006/math" xmlns:v="urn:schemas-microsoft-com:vml" xmlns:w10="urn:schemas-microsoft-com:office:word" xmlns:w="http://schemas.openxmlformats.org/wordprocessingml/2006/main" xmlns:w14="http://schemas.microsoft.com/office/word/2010/wordml" xmlns:w15="http://schemas.microsoft.com/office/word/2012/wordml" xmlns:w16cex="http://schemas.microsoft.com/office/word/2018/wordml/cex" xmlns:w16cid="http://schemas.microsoft.com/office/word/2016/wordml/cid" xmlns:w16="http://schemas.microsoft.com/office/word/2018/wordml" xmlns:w16sdtdh="http://schemas.microsoft.com/office/word/2020/wordml/sdtdatahash" xmlns:w16se="http://schemas.microsoft.com/office/word/2015/wordml/symex" xmlns:sl="http://schemas.openxmlformats.org/schemaLibrary/2006/main" mc:Ignorable="w14 w15 w16se w16cid w16 w16cex w16sdtdh">
-  <w:view w:val="normal"/>
-  <w:defaultTabStop w:val="720"/>
-  <w:characterSpacingControl w:val="doNotCompress"/>
-  <w:compat>
-    <w:useFELayout/>
-    <w:compatSetting w:name="compatibilityMode" w:uri="http://schemas.microsoft.com/office/word" w:val="15"/>
-    <w:compatSetting w:name="overrideTableStyleFontSizeAndJustification" w:uri="http://schemas.microsoft.com/office/word" w:val="1"/>
-    <w:compatSetting w:name="enableOpenTypeFeatures" w:uri="http://schemas.microsoft.com/office/word" w:val="1"/>
-    <w:compatSetting w:name="doNotFlipMirrorIndents" w:uri="http://schemas.microsoft.com/office/word" w:val="1"/>
-    <w:compatSetting w:name="differentiateMultirowTableHeaders" w:uri="http://schemas.microsoft.com/office/word" w:val="1"/>
-    <w:compatSetting w:name="useWord2013TrackBottomHyphenation" w:uri="http://schemas.microsoft.com/office/word" w:val="0"/>
-  </w:compat>
-  <w:rsids>
-    <w:rsidRoot w:val="008B19FC"/>
-    <w:rsid w:val="005D20B4"/>
-    <w:rsid w:val="008B19FC"/>
-    <w:rsid w:val="00A822E9"/>
-    <w:rsid w:val="00F24ED8"/>
-  </w:rsids>
-  <m:mathPr>
-    <m:mathFont m:val="Cambria Math"/>
-    <m:brkBin m:val="before"/>
-    <m:brkBinSub m:val="--"/>
-    <m:smallFrac m:val="0"/>
-    <m:dispDef/>
-    <m:lMargin m:val="0"/>
-    <m:rMargin m:val="0"/>
-    <m:defJc m:val="centerGroup"/>
-    <m:wrapIndent m:val="1440"/>
-    <m:intLim m:val="subSup"/>
-    <m:naryLim m:val="undOvr"/>
-  </m:mathPr>
-  <w:themeFontLang w:val="en-VN"/>
-  <w:clrSchemeMapping w:bg1="light1" w:t1="dark1" w:bg2="light2" w:t2="dark2" w:accent1="accent1" w:accent2="accent2" w:accent3="accent3" w:accent4="accent4" w:accent5="accent5" w:accent6="accent6" w:hyperlink="hyperlink" w:followedHyperlink="followedHyperlink"/>
-  <w:decimalSymbol w:val=","/>
-  <w:listSeparator w:val=","/>
-  <w15:chartTrackingRefBased/>
-</w:settings>
-</file>
-
-<file path=word/glossary/styles.xml><?xml version="1.0" encoding="utf-8"?>
-<w:styles xmlns:mc="http://schemas.openxmlformats.org/markup-compatibility/2006" xmlns:r="http://schemas.openxmlformats.org/officeDocument/2006/relationships" xmlns:w="http://schemas.openxmlformats.org/wordprocessingml/2006/main" xmlns:w14="http://schemas.microsoft.com/office/word/2010/wordml" xmlns:w15="http://schemas.microsoft.com/office/word/2012/wordml" xmlns:w16cex="http://schemas.microsoft.com/office/word/2018/wordml/cex" xmlns:w16cid="http://schemas.microsoft.com/office/word/2016/wordml/cid" xmlns:w16="http://schemas.microsoft.com/office/word/2018/wordml" xmlns:w16sdtdh="http://schemas.microsoft.com/office/word/2020/wordml/sdtdatahash" xmlns:w16se="http://schemas.microsoft.com/office/word/2015/wordml/symex" mc:Ignorable="w14 w15 w16se w16cid w16 w16cex w16sdtdh">
-  <w:docDefaults>
-    <w:rPrDefault>
-      <w:rPr>
-        <w:rFonts w:asciiTheme="minorHAnsi" w:eastAsiaTheme="minorEastAsia" w:hAnsiTheme="minorHAnsi" w:cstheme="minorBidi"/>
-        <w:kern w:val="2"/>
-        <w:sz w:val="24"/>
-        <w:szCs w:val="24"/>
-        <w:lang w:val="en-VN" w:eastAsia="en-US" w:bidi="ar-SA"/>
-        <w14:ligatures w14:val="standardContextual"/>
-      </w:rPr>
-    </w:rPrDefault>
-    <w:pPrDefault/>
-  </w:docDefaults>
-  <w:latentStyles w:defLockedState="0" w:defUIPriority="99" w:defSemiHidden="0" w:defUnhideWhenUsed="0" w:defQFormat="0" w:count="376">
-    <w:lsdException w:name="Normal" w:uiPriority="0" w:qFormat="1"/>
-    <w:lsdException w:name="heading 1" w:uiPriority="9" w:qFormat="1"/>
-    <w:lsdException w:name="heading 2" w:semiHidden="1" w:uiPriority="9" w:unhideWhenUsed="1" w:qFormat="1"/>
-    <w:lsdException w:name="heading 3" w:semiHidden="1" w:uiPriority="9" w:unhideWhenUsed="1" w:qFormat="1"/>
-    <w:lsdException w:name="heading 4" w:semiHidden="1" w:uiPriority="9" w:unhideWhenUsed="1" w:qFormat="1"/>
-    <w:lsdException w:name="heading 5" w:semiHidden="1" w:uiPriority="9" w:unhideWhenUsed="1" w:qFormat="1"/>
-    <w:lsdException w:name="heading 6" w:semiHidden="1" w:uiPriority="9" w:unhideWhenUsed="1" w:qFormat="1"/>
-    <w:lsdException w:name="heading 7" w:semiHidden="1" w:uiPriority="9" w:unhideWhenUsed="1" w:qFormat="1"/>
-    <w:lsdException w:name="heading 8" w:semiHidden="1" w:uiPriority="9" w:unhideWhenUsed="1" w:qFormat="1"/>
-    <w:lsdException w:name="heading 9" w:semiHidden="1" w:uiPriority="9" w:unhideWhenUsed="1" w:qFormat="1"/>
-    <w:lsdException w:name="index 1" w:semiHidden="1" w:unhideWhenUsed="1"/>
-    <w:lsdException w:name="index 2" w:semiHidden="1" w:unhideWhenUsed="1"/>
-    <w:lsdException w:name="index 3" w:semiHidden="1" w:unhideWhenUsed="1"/>
-    <w:lsdException w:name="index 4" w:semiHidden="1" w:unhideWhenUsed="1"/>
-    <w:lsdException w:name="index 5" w:semiHidden="1" w:unhideWhenUsed="1"/>
-    <w:lsdException w:name="index 6" w:semiHidden="1" w:unhideWhenUsed="1"/>
-    <w:lsdException w:name="index 7" w:semiHidden="1" w:unhideWhenUsed="1"/>
-    <w:lsdException w:name="index 8" w:semiHidden="1" w:unhideWhenUsed="1"/>
-    <w:lsdException w:name="index 9" w:semiHidden="1" w:unhideWhenUsed="1"/>
-    <w:lsdException w:name="toc 1" w:semiHidden="1" w:uiPriority="39" w:unhideWhenUsed="1"/>
-    <w:lsdException w:name="toc 2" w:semiHidden="1" w:uiPriority="39" w:unhideWhenUsed="1"/>
-    <w:lsdException w:name="toc 3" w:semiHidden="1" w:uiPriority="39" w:unhideWhenUsed="1"/>
-    <w:lsdException w:name="toc 4" w:semiHidden="1" w:uiPriority="39" w:unhideWhenUsed="1"/>
-    <w:lsdException w:name="toc 5" w:semiHidden="1" w:uiPriority="39" w:unhideWhenUsed="1"/>
-    <w:lsdException w:name="toc 6" w:semiHidden="1" w:uiPriority="39" w:unhideWhenUsed="1"/>
-    <w:lsdException w:name="toc 7" w:semiHidden="1" w:uiPriority="39" w:unhideWhenUsed="1"/>
-    <w:lsdException w:name="toc 8" w:semiHidden="1" w:uiPriority="39" w:unhideWhenUsed="1"/>
-    <w:lsdException w:name="toc 9" w:semiHidden="1" w:uiPriority="39" w:unhideWhenUsed="1"/>
-    <w:lsdException w:name="Normal Indent" w:semiHidden="1" w:unhideWhenUsed="1"/>
-    <w:lsdException w:name="footnote text" w:semiHidden="1" w:unhideWhenUsed="1"/>
-    <w:lsdException w:name="annotation text" w:semiHidden="1" w:unhideWhenUsed="1"/>
-    <w:lsdException w:name="header" w:semiHidden="1" w:unhideWhenUsed="1"/>
-    <w:lsdException w:name="footer" w:semiHidden="1" w:unhideWhenUsed="1"/>
-    <w:lsdException w:name="index heading" w:semiHidden="1" w:unhideWhenUsed="1"/>
-    <w:lsdException w:name="caption" w:semiHidden="1" w:uiPriority="35" w:unhideWhenUsed="1" w:qFormat="1"/>
-    <w:lsdException w:name="table of figures" w:semiHidden="1" w:unhideWhenUsed="1"/>
-    <w:lsdException w:name="envelope address" w:semiHidden="1" w:unhideWhenUsed="1"/>
-    <w:lsdException w:name="envelope return" w:semiHidden="1" w:unhideWhenUsed="1"/>
-    <w:lsdException w:name="footnote reference" w:semiHidden="1" w:unhideWhenUsed="1"/>
-    <w:lsdException w:name="annotation reference" w:semiHidden="1" w:unhideWhenUsed="1"/>
-    <w:lsdException w:name="line number" w:semiHidden="1" w:unhideWhenUsed="1"/>
-    <w:lsdException w:name="page number" w:semiHidden="1" w:unhideWhenUsed="1"/>
-    <w:lsdException w:name="endnote reference" w:semiHidden="1" w:unhideWhenUsed="1"/>
-    <w:lsdException w:name="endnote text" w:semiHidden="1" w:unhideWhenUsed="1"/>
-    <w:lsdException w:name="table of authorities" w:semiHidden="1" w:unhideWhenUsed="1"/>
-    <w:lsdException w:name="macro" w:semiHidden="1" w:unhideWhenUsed="1"/>
-    <w:lsdException w:name="toa heading" w:semiHidden="1" w:unhideWhenUsed="1"/>
-    <w:lsdException w:name="List" w:semiHidden="1" w:unhideWhenUsed="1"/>
-    <w:lsdException w:name="List Bullet" w:semiHidden="1" w:unhideWhenUsed="1"/>
-    <w:lsdException w:name="List Number" w:semiHidden="1" w:unhideWhenUsed="1"/>
-    <w:lsdException w:name="List 2" w:semiHidden="1" w:unhideWhenUsed="1"/>
-    <w:lsdException w:name="List 3" w:semiHidden="1" w:unhideWhenUsed="1"/>
-    <w:lsdException w:name="List 4" w:semiHidden="1" w:unhideWhenUsed="1"/>
-    <w:lsdException w:name="List 5" w:semiHidden="1" w:unhideWhenUsed="1"/>
-    <w:lsdException w:name="List Bullet 2" w:semiHidden="1" w:unhideWhenUsed="1"/>
-    <w:lsdException w:name="List Bullet 3" w:semiHidden="1" w:unhideWhenUsed="1"/>
-    <w:lsdException w:name="List Bullet 4" w:semiHidden="1" w:unhideWhenUsed="1"/>
-    <w:lsdException w:name="List Bullet 5" w:semiHidden="1" w:unhideWhenUsed="1"/>
-    <w:lsdException w:name="List Number 2" w:semiHidden="1" w:unhideWhenUsed="1"/>
-    <w:lsdException w:name="List Number 3" w:semiHidden="1" w:unhideWhenUsed="1"/>
-    <w:lsdException w:name="List Number 4" w:semiHidden="1" w:unhideWhenUsed="1"/>
-    <w:lsdException w:name="List Number 5" w:semiHidden="1" w:unhideWhenUsed="1"/>
-    <w:lsdException w:name="Title" w:uiPriority="10" w:qFormat="1"/>
-    <w:lsdException w:name="Closing" w:semiHidden="1" w:unhideWhenUsed="1"/>
-    <w:lsdException w:name="Signature" w:semiHidden="1" w:unhideWhenUsed="1"/>
-    <w:lsdException w:name="Default Paragraph Font" w:semiHidden="1" w:uiPriority="1" w:unhideWhenUsed="1"/>
-    <w:lsdException w:name="Body Text" w:semiHidden="1" w:unhideWhenUsed="1"/>
-    <w:lsdException w:name="Body Text Indent" w:semiHidden="1" w:unhideWhenUsed="1"/>
-    <w:lsdException w:name="List Continue" w:semiHidden="1" w:unhideWhenUsed="1"/>
-    <w:lsdException w:name="List Continue 2" w:semiHidden="1" w:unhideWhenUsed="1"/>
-    <w:lsdException w:name="List Continue 3" w:semiHidden="1" w:unhideWhenUsed="1"/>
-    <w:lsdException w:name="List Continue 4" w:semiHidden="1" w:unhideWhenUsed="1"/>
-    <w:lsdException w:name="List Continue 5" w:semiHidden="1" w:unhideWhenUsed="1"/>
-    <w:lsdException w:name="Message Header" w:semiHidden="1" w:unhideWhenUsed="1"/>
-    <w:lsdException w:name="Subtitle" w:uiPriority="11" w:qFormat="1"/>
-    <w:lsdException w:name="Salutation" w:semiHidden="1" w:unhideWhenUsed="1"/>
-    <w:lsdException w:name="Date" w:semiHidden="1" w:unhideWhenUsed="1"/>
-    <w:lsdException w:name="Body Text First Indent" w:semiHidden="1" w:unhideWhenUsed="1"/>
-    <w:lsdException w:name="Body Text First Indent 2" w:semiHidden="1" w:unhideWhenUsed="1"/>
-    <w:lsdException w:name="Note Heading" w:semiHidden="1" w:unhideWhenUsed="1"/>
-    <w:lsdException w:name="Body Text 2" w:semiHidden="1" w:unhideWhenUsed="1"/>
-    <w:lsdException w:name="Body Text 3" w:semiHidden="1" w:unhideWhenUsed="1"/>
-    <w:lsdException w:name="Body Text Indent 2" w:semiHidden="1" w:unhideWhenUsed="1"/>
-    <w:lsdException w:name="Body Text Indent 3" w:semiHidden="1" w:unhideWhenUsed="1"/>
-    <w:lsdException w:name="Block Text" w:semiHidden="1" w:unhideWhenUsed="1"/>
-    <w:lsdException w:name="Hyperlink" w:semiHidden="1" w:unhideWhenUsed="1"/>
-    <w:lsdException w:name="FollowedHyperlink" w:semiHidden="1" w:unhideWhenUsed="1"/>
-    <w:lsdException w:name="Strong" w:uiPriority="22" w:qFormat="1"/>
-    <w:lsdException w:name="Emphasis" w:uiPriority="20" w:qFormat="1"/>
-    <w:lsdException w:name="Document Map" w:semiHidden="1" w:unhideWhenUsed="1"/>
-    <w:lsdException w:name="Plain Text" w:semiHidden="1" w:unhideWhenUsed="1"/>
-    <w:lsdException w:name="E-mail Signature" w:semiHidden="1" w:unhideWhenUsed="1"/>
-    <w:lsdException w:name="HTML Top of Form" w:semiHidden="1" w:unhideWhenUsed="1"/>
-    <w:lsdException w:name="HTML Bottom of Form" w:semiHidden="1" w:unhideWhenUsed="1"/>
-    <w:lsdException w:name="Normal (Web)" w:semiHidden="1" w:unhideWhenUsed="1"/>
-    <w:lsdException w:name="HTML Acronym" w:semiHidden="1" w:unhideWhenUsed="1"/>
-    <w:lsdException w:name="HTML Address" w:semiHidden="1" w:unhideWhenUsed="1"/>
-    <w:lsdException w:name="HTML Cite" w:semiHidden="1" w:unhideWhenUsed="1"/>
-    <w:lsdException w:name="HTML Code" w:semiHidden="1" w:unhideWhenUsed="1"/>
-    <w:lsdException w:name="HTML Definition" w:semiHidden="1" w:unhideWhenUsed="1"/>
-    <w:lsdException w:name="HTML Keyboard" w:semiHidden="1" w:unhideWhenUsed="1"/>
-    <w:lsdException w:name="HTML Preformatted" w:semiHidden="1" w:unhideWhenUsed="1"/>
-    <w:lsdException w:name="HTML Sample" w:semiHidden="1" w:unhideWhenUsed="1"/>
-    <w:lsdException w:name="HTML Typewriter" w:semiHidden="1" w:unhideWhenUsed="1"/>
-    <w:lsdException w:name="HTML Variable" w:semiHidden="1" w:unhideWhenUsed="1"/>
-    <w:lsdException w:name="Normal Table" w:semiHidden="1" w:unhideWhenUsed="1"/>
-    <w:lsdException w:name="annotation subject" w:semiHidden="1" w:unhideWhenUsed="1"/>
-    <w:lsdException w:name="No List" w:semiHidden="1" w:unhideWhenUsed="1"/>
-    <w:lsdException w:name="Outline List 1" w:semiHidden="1" w:unhideWhenUsed="1"/>
-    <w:lsdException w:name="Outline List 2" w:semiHidden="1" w:unhideWhenUsed="1"/>
-    <w:lsdException w:name="Outline List 3" w:semiHidden="1" w:unhideWhenUsed="1"/>
-    <w:lsdException w:name="Table Simple 1" w:semiHidden="1" w:unhideWhenUsed="1"/>
-    <w:lsdException w:name="Table Simple 2" w:semiHidden="1" w:unhideWhenUsed="1"/>
-    <w:lsdException w:name="Table Simple 3" w:semiHidden="1" w:unhideWhenUsed="1"/>
-    <w:lsdException w:name="Table Classic 1" w:semiHidden="1" w:unhideWhenUsed="1"/>
-    <w:lsdException w:name="Table Classic 2" w:semiHidden="1" w:unhideWhenUsed="1"/>
-    <w:lsdException w:name="Table Classic 3" w:semiHidden="1" w:unhideWhenUsed="1"/>
-    <w:lsdException w:name="Table Classic 4" w:semiHidden="1" w:unhideWhenUsed="1"/>
-    <w:lsdException w:name="Table Colorful 1" w:semiHidden="1" w:unhideWhenUsed="1"/>
-    <w:lsdException w:name="Table Colorful 2" w:semiHidden="1" w:unhideWhenUsed="1"/>
-    <w:lsdException w:name="Table Colorful 3" w:semiHidden="1" w:unhideWhenUsed="1"/>
-    <w:lsdException w:name="Table Columns 1" w:semiHidden="1" w:unhideWhenUsed="1"/>
-    <w:lsdException w:name="Table Columns 2" w:semiHidden="1" w:unhideWhenUsed="1"/>
-    <w:lsdException w:name="Table Columns 3" w:semiHidden="1" w:unhideWhenUsed="1"/>
-    <w:lsdException w:name="Table Columns 4" w:semiHidden="1" w:unhideWhenUsed="1"/>
-    <w:lsdException w:name="Table Columns 5" w:semiHidden="1" w:unhideWhenUsed="1"/>
-    <w:lsdException w:name="Table Grid 1" w:semiHidden="1" w:unhideWhenUsed="1"/>
-    <w:lsdException w:name="Table Grid 2" w:semiHidden="1" w:unhideWhenUsed="1"/>
-    <w:lsdException w:name="Table Grid 3" w:semiHidden="1" w:unhideWhenUsed="1"/>
-    <w:lsdException w:name="Table Grid 4" w:semiHidden="1" w:unhideWhenUsed="1"/>
-    <w:lsdException w:name="Table Grid 5" w:semiHidden="1" w:unhideWhenUsed="1"/>
-    <w:lsdException w:name="Table Grid 6" w:semiHidden="1" w:unhideWhenUsed="1"/>
-    <w:lsdException w:name="Table Grid 7" w:semiHidden="1" w:unhideWhenUsed="1"/>
-    <w:lsdException w:name="Table Grid 8" w:semiHidden="1" w:unhideWhenUsed="1"/>
-    <w:lsdException w:name="Table List 1" w:semiHidden="1" w:unhideWhenUsed="1"/>
-    <w:lsdException w:name="Table List 2" w:semiHidden="1" w:unhideWhenUsed="1"/>
-    <w:lsdException w:name="Table List 3" w:semiHidden="1" w:unhideWhenUsed="1"/>
-    <w:lsdException w:name="Table List 4" w:semiHidden="1" w:unhideWhenUsed="1"/>
-    <w:lsdException w:name="Table List 5" w:semiHidden="1" w:unhideWhenUsed="1"/>
-    <w:lsdException w:name="Table List 6" w:semiHidden="1" w:unhideWhenUsed="1"/>
-    <w:lsdException w:name="Table List 7" w:semiHidden="1" w:unhideWhenUsed="1"/>
-    <w:lsdException w:name="Table List 8" w:semiHidden="1" w:unhideWhenUsed="1"/>
-    <w:lsdException w:name="Table 3D effects 1" w:semiHidden="1" w:unhideWhenUsed="1"/>
-    <w:lsdException w:name="Table 3D effects 2" w:semiHidden="1" w:unhideWhenUsed="1"/>
-    <w:lsdException w:name="Table 3D effects 3" w:semiHidden="1" w:unhideWhenUsed="1"/>
-    <w:lsdException w:name="Table Contemporary" w:semiHidden="1" w:unhideWhenUsed="1"/>
-    <w:lsdException w:name="Table Elegant" w:semiHidden="1" w:unhideWhenUsed="1"/>
-    <w:lsdException w:name="Table Professional" w:semiHidden="1" w:unhideWhenUsed="1"/>
-    <w:lsdException w:name="Table Subtle 1" w:semiHidden="1" w:unhideWhenUsed="1"/>
-    <w:lsdException w:name="Table Subtle 2" w:semiHidden="1" w:unhideWhenUsed="1"/>
-    <w:lsdException w:name="Table Web 1" w:semiHidden="1" w:unhideWhenUsed="1"/>
-    <w:lsdException w:name="Table Web 2" w:semiHidden="1" w:unhideWhenUsed="1"/>
-    <w:lsdException w:name="Table Web 3" w:semiHidden="1" w:unhideWhenUsed="1"/>
-    <w:lsdException w:name="Balloon Text" w:semiHidden="1" w:unhideWhenUsed="1"/>
-    <w:lsdException w:name="Table Grid" w:uiPriority="39"/>
-    <w:lsdException w:name="Table Theme" w:semiHidden="1" w:unhideWhenUsed="1"/>
-    <w:lsdException w:name="Placeholder Text" w:semiHidden="1"/>
-    <w:lsdException w:name="No Spacing" w:uiPriority="1" w:qFormat="1"/>
-    <w:lsdException w:name="Light Shading" w:uiPriority="60"/>
-    <w:lsdException w:name="Light List" w:uiPriority="61"/>
-    <w:lsdException w:name="Light Grid" w:uiPriority="62"/>
-    <w:lsdException w:name="Medium Shading 1" w:uiPriority="63"/>
-    <w:lsdException w:name="Medium Shading 2" w:uiPriority="64"/>
-    <w:lsdException w:name="Medium List 1" w:uiPriority="65"/>
-    <w:lsdException w:name="Medium List 2" w:uiPriority="66"/>
-    <w:lsdException w:name="Medium Grid 1" w:uiPriority="67"/>
-    <w:lsdException w:name="Medium Grid 2" w:uiPriority="68"/>
-    <w:lsdException w:name="Medium Grid 3" w:uiPriority="69"/>
-    <w:lsdException w:name="Dark List" w:uiPriority="70"/>
-    <w:lsdException w:name="Colorful Shading" w:uiPriority="71"/>
-    <w:lsdException w:name="Colorful List" w:uiPriority="72"/>
-    <w:lsdException w:name="Colorful Grid" w:uiPriority="73"/>
-    <w:lsdException w:name="Light Shading Accent 1" w:uiPriority="60"/>
-    <w:lsdException w:name="Light List Accent 1" w:uiPriority="61"/>
-    <w:lsdException w:name="Light Grid Accent 1" w:uiPriority="62"/>
-    <w:lsdException w:name="Medium Shading 1 Accent 1" w:uiPriority="63"/>
-    <w:lsdException w:name="Medium Shading 2 Accent 1" w:uiPriority="64"/>
-    <w:lsdException w:name="Medium List 1 Accent 1" w:uiPriority="65"/>
-    <w:lsdException w:name="Revision" w:semiHidden="1"/>
-    <w:lsdException w:name="List Paragraph" w:uiPriority="34" w:qFormat="1"/>
-    <w:lsdException w:name="Quote" w:uiPriority="29" w:qFormat="1"/>
-    <w:lsdException w:name="Intense Quote" w:uiPriority="30" w:qFormat="1"/>
-    <w:lsdException w:name="Medium List 2 Accent 1" w:uiPriority="66"/>
-    <w:lsdException w:name="Medium Grid 1 Accent 1" w:uiPriority="67"/>
-    <w:lsdException w:name="Medium Grid 2 Accent 1" w:uiPriority="68"/>
-    <w:lsdException w:name="Medium Grid 3 Accent 1" w:uiPriority="69"/>
-    <w:lsdException w:name="Dark List Accent 1" w:uiPriority="70"/>
-    <w:lsdException w:name="Colorful Shading Accent 1" w:uiPriority="71"/>
-    <w:lsdException w:name="Colorful List Accent 1" w:uiPriority="72"/>
-    <w:lsdException w:name="Colorful Grid Accent 1" w:uiPriority="73"/>
-    <w:lsdException w:name="Light Shading Accent 2" w:uiPriority="60"/>
-    <w:lsdException w:name="Light List Accent 2" w:uiPriority="61"/>
-    <w:lsdException w:name="Light Grid Accent 2" w:uiPriority="62"/>
-    <w:lsdException w:name="Medium Shading 1 Accent 2" w:uiPriority="63"/>
-    <w:lsdException w:name="Medium Shading 2 Accent 2" w:uiPriority="64"/>
-    <w:lsdException w:name="Medium List 1 Accent 2" w:uiPriority="65"/>
-    <w:lsdException w:name="Medium List 2 Accent 2" w:uiPriority="66"/>
-    <w:lsdException w:name="Medium Grid 1 Accent 2" w:uiPriority="67"/>
-    <w:lsdException w:name="Medium Grid 2 Accent 2" w:uiPriority="68"/>
-    <w:lsdException w:name="Medium Grid 3 Accent 2" w:uiPriority="69"/>
-    <w:lsdException w:name="Dark List Accent 2" w:uiPriority="70"/>
-    <w:lsdException w:name="Colorful Shading Accent 2" w:uiPriority="71"/>
-    <w:lsdException w:name="Colorful List Accent 2" w:uiPriority="72"/>
-    <w:lsdException w:name="Colorful Grid Accent 2" w:uiPriority="73"/>
-    <w:lsdException w:name="Light Shading Accent 3" w:uiPriority="60"/>
-    <w:lsdException w:name="Light List Accent 3" w:uiPriority="61"/>
-    <w:lsdException w:name="Light Grid Accent 3" w:uiPriority="62"/>
-    <w:lsdException w:name="Medium Shading 1 Accent 3" w:uiPriority="63"/>
-    <w:lsdException w:name="Medium Shading 2 Accent 3" w:uiPriority="64"/>
-    <w:lsdException w:name="Medium List 1 Accent 3" w:uiPriority="65"/>
-    <w:lsdException w:name="Medium List 2 Accent 3" w:uiPriority="66"/>
-    <w:lsdException w:name="Medium Grid 1 Accent 3" w:uiPriority="67"/>
-    <w:lsdException w:name="Medium Grid 2 Accent 3" w:uiPriority="68"/>
-    <w:lsdException w:name="Medium Grid 3 Accent 3" w:uiPriority="69"/>
-    <w:lsdException w:name="Dark List Accent 3" w:uiPriority="70"/>
-    <w:lsdException w:name="Colorful Shading Accent 3" w:uiPriority="71"/>
-    <w:lsdException w:name="Colorful List Accent 3" w:uiPriority="72"/>
-    <w:lsdException w:name="Colorful Grid Accent 3" w:uiPriority="73"/>
-    <w:lsdException w:name="Light Shading Accent 4" w:uiPriority="60"/>
-    <w:lsdException w:name="Light List Accent 4" w:uiPriority="61"/>
-    <w:lsdException w:name="Light Grid Accent 4" w:uiPriority="62"/>
-    <w:lsdException w:name="Medium Shading 1 Accent 4" w:uiPriority="63"/>
-    <w:lsdException w:name="Medium Shading 2 Accent 4" w:uiPriority="64"/>
-    <w:lsdException w:name="Medium List 1 Accent 4" w:uiPriority="65"/>
-    <w:lsdException w:name="Medium List 2 Accent 4" w:uiPriority="66"/>
-    <w:lsdException w:name="Medium Grid 1 Accent 4" w:uiPriority="67"/>
-    <w:lsdException w:name="Medium Grid 2 Accent 4" w:uiPriority="68"/>
-    <w:lsdException w:name="Medium Grid 3 Accent 4" w:uiPriority="69"/>
-    <w:lsdException w:name="Dark List Accent 4" w:uiPriority="70"/>
-    <w:lsdException w:name="Colorful Shading Accent 4" w:uiPriority="71"/>
-    <w:lsdException w:name="Colorful List Accent 4" w:uiPriority="72"/>
-    <w:lsdException w:name="Colorful Grid Accent 4" w:uiPriority="73"/>
-    <w:lsdException w:name="Light Shading Accent 5" w:uiPriority="60"/>
-    <w:lsdException w:name="Light List Accent 5" w:uiPriority="61"/>
-    <w:lsdException w:name="Light Grid Accent 5" w:uiPriority="62"/>
-    <w:lsdException w:name="Medium Shading 1 Accent 5" w:uiPriority="63"/>
-    <w:lsdException w:name="Medium Shading 2 Accent 5" w:uiPriority="64"/>
-    <w:lsdException w:name="Medium List 1 Accent 5" w:uiPriority="65"/>
-    <w:lsdException w:name="Medium List 2 Accent 5" w:uiPriority="66"/>
-    <w:lsdException w:name="Medium Grid 1 Accent 5" w:uiPriority="67"/>
-    <w:lsdException w:name="Medium Grid 2 Accent 5" w:uiPriority="68"/>
-    <w:lsdException w:name="Medium Grid 3 Accent 5" w:uiPriority="69"/>
-    <w:lsdException w:name="Dark List Accent 5" w:uiPriority="70"/>
-    <w:lsdException w:name="Colorful Shading Accent 5" w:uiPriority="71"/>
-    <w:lsdException w:name="Colorful List Accent 5" w:uiPriority="72"/>
-    <w:lsdException w:name="Colorful Grid Accent 5" w:uiPriority="73"/>
-    <w:lsdException w:name="Light Shading Accent 6" w:uiPriority="60"/>
-    <w:lsdException w:name="Light List Accent 6" w:uiPriority="61"/>
-    <w:lsdException w:name="Light Grid Accent 6" w:uiPriority="62"/>
-    <w:lsdException w:name="Medium Shading 1 Accent 6" w:uiPriority="63"/>
-    <w:lsdException w:name="Medium Shading 2 Accent 6" w:uiPriority="64"/>
-    <w:lsdException w:name="Medium List 1 Accent 6" w:uiPriority="65"/>
-    <w:lsdException w:name="Medium List 2 Accent 6" w:uiPriority="66"/>
-    <w:lsdException w:name="Medium Grid 1 Accent 6" w:uiPriority="67"/>
-    <w:lsdException w:name="Medium Grid 2 Accent 6" w:uiPriority="68"/>
-    <w:lsdException w:name="Medium Grid 3 Accent 6" w:uiPriority="69"/>
-    <w:lsdException w:name="Dark List Accent 6" w:uiPriority="70"/>
-    <w:lsdException w:name="Colorful Shading Accent 6" w:uiPriority="71"/>
-    <w:lsdException w:name="Colorful List Accent 6" w:uiPriority="72"/>
-    <w:lsdException w:name="Colorful Grid Accent 6" w:uiPriority="73"/>
-    <w:lsdException w:name="Subtle Emphasis" w:uiPriority="19" w:qFormat="1"/>
-    <w:lsdException w:name="Intense Emphasis" w:uiPriority="21" w:qFormat="1"/>
-    <w:lsdException w:name="Subtle Reference" w:uiPriority="31" w:qFormat="1"/>
-    <w:lsdException w:name="Intense Reference" w:uiPriority="32" w:qFormat="1"/>
-    <w:lsdException w:name="Book Title" w:uiPriority="33" w:qFormat="1"/>
-    <w:lsdException w:name="Bibliography" w:semiHidden="1" w:uiPriority="37" w:unhideWhenUsed="1"/>
-    <w:lsdException w:name="TOC Heading" w:semiHidden="1" w:uiPriority="39" w:unhideWhenUsed="1" w:qFormat="1"/>
-    <w:lsdException w:name="Plain Table 1" w:uiPriority="41"/>
-    <w:lsdException w:name="Plain Table 2" w:uiPriority="42"/>
-    <w:lsdException w:name="Plain Table 3" w:uiPriority="43"/>
-    <w:lsdException w:name="Plain Table 4" w:uiPriority="44"/>
-    <w:lsdException w:name="Plain Table 5" w:uiPriority="45"/>
-    <w:lsdException w:name="Grid Table Light" w:uiPriority="40"/>
-    <w:lsdException w:name="Grid Table 1 Light" w:uiPriority="46"/>
-    <w:lsdException w:name="Grid Table 2" w:uiPriority="47"/>
-    <w:lsdException w:name="Grid Table 3" w:uiPriority="48"/>
-    <w:lsdException w:name="Grid Table 4" w:uiPriority="49"/>
-    <w:lsdException w:name="Grid Table 5 Dark" w:uiPriority="50"/>
-    <w:lsdException w:name="Grid Table 6 Colorful" w:uiPriority="51"/>
-    <w:lsdException w:name="Grid Table 7 Colorful" w:uiPriority="52"/>
-    <w:lsdException w:name="Grid Table 1 Light Accent 1" w:uiPriority="46"/>
-    <w:lsdException w:name="Grid Table 2 Accent 1" w:uiPriority="47"/>
-    <w:lsdException w:name="Grid Table 3 Accent 1" w:uiPriority="48"/>
-    <w:lsdException w:name="Grid Table 4 Accent 1" w:uiPriority="49"/>
-    <w:lsdException w:name="Grid Table 5 Dark Accent 1" w:uiPriority="50"/>
-    <w:lsdException w:name="Grid Table 6 Colorful Accent 1" w:uiPriority="51"/>
-    <w:lsdException w:name="Grid Table 7 Colorful Accent 1" w:uiPriority="52"/>
-    <w:lsdException w:name="Grid Table 1 Light Accent 2" w:uiPriority="46"/>
-    <w:lsdException w:name="Grid Table 2 Accent 2" w:uiPriority="47"/>
-    <w:lsdException w:name="Grid Table 3 Accent 2" w:uiPriority="48"/>
-    <w:lsdException w:name="Grid Table 4 Accent 2" w:uiPriority="49"/>
-    <w:lsdException w:name="Grid Table 5 Dark Accent 2" w:uiPriority="50"/>
-    <w:lsdException w:name="Grid Table 6 Colorful Accent 2" w:uiPriority="51"/>
-    <w:lsdException w:name="Grid Table 7 Colorful Accent 2" w:uiPriority="52"/>
-    <w:lsdException w:name="Grid Table 1 Light Accent 3" w:uiPriority="46"/>
-    <w:lsdException w:name="Grid Table 2 Accent 3" w:uiPriority="47"/>
-    <w:lsdException w:name="Grid Table 3 Accent 3" w:uiPriority="48"/>
-    <w:lsdException w:name="Grid Table 4 Accent 3" w:uiPriority="49"/>
-    <w:lsdException w:name="Grid Table 5 Dark Accent 3" w:uiPriority="50"/>
-    <w:lsdException w:name="Grid Table 6 Colorful Accent 3" w:uiPriority="51"/>
-    <w:lsdException w:name="Grid Table 7 Colorful Accent 3" w:uiPriority="52"/>
-    <w:lsdException w:name="Grid Table 1 Light Accent 4" w:uiPriority="46"/>
-    <w:lsdException w:name="Grid Table 2 Accent 4" w:uiPriority="47"/>
-    <w:lsdException w:name="Grid Table 3 Accent 4" w:uiPriority="48"/>
-    <w:lsdException w:name="Grid Table 4 Accent 4" w:uiPriority="49"/>
-    <w:lsdException w:name="Grid Table 5 Dark Accent 4" w:uiPriority="50"/>
-    <w:lsdException w:name="Grid Table 6 Colorful Accent 4" w:uiPriority="51"/>
-    <w:lsdException w:name="Grid Table 7 Colorful Accent 4" w:uiPriority="52"/>
-    <w:lsdException w:name="Grid Table 1 Light Accent 5" w:uiPriority="46"/>
-    <w:lsdException w:name="Grid Table 2 Accent 5" w:uiPriority="47"/>
-    <w:lsdException w:name="Grid Table 3 Accent 5" w:uiPriority="48"/>
-    <w:lsdException w:name="Grid Table 4 Accent 5" w:uiPriority="49"/>
-    <w:lsdException w:name="Grid Table 5 Dark Accent 5" w:uiPriority="50"/>
-    <w:lsdException w:name="Grid Table 6 Colorful Accent 5" w:uiPriority="51"/>
-    <w:lsdException w:name="Grid Table 7 Colorful Accent 5" w:uiPriority="52"/>
-    <w:lsdException w:name="Grid Table 1 Light Accent 6" w:uiPriority="46"/>
-    <w:lsdException w:name="Grid Table 2 Accent 6" w:uiPriority="47"/>
-    <w:lsdException w:name="Grid Table 3 Accent 6" w:uiPriority="48"/>
-    <w:lsdException w:name="Grid Table 4 Accent 6" w:uiPriority="49"/>
-    <w:lsdException w:name="Grid Table 5 Dark Accent 6" w:uiPriority="50"/>
-    <w:lsdException w:name="Grid Table 6 Colorful Accent 6" w:uiPriority="51"/>
-    <w:lsdException w:name="Grid Table 7 Colorful Accent 6" w:uiPriority="52"/>
-    <w:lsdException w:name="List Table 1 Light" w:uiPriority="46"/>
-    <w:lsdException w:name="List Table 2" w:uiPriority="47"/>
-    <w:lsdException w:name="List Table 3" w:uiPriority="48"/>
-    <w:lsdException w:name="List Table 4" w:uiPriority="49"/>
-    <w:lsdException w:name="List Table 5 Dark" w:uiPriority="50"/>
-    <w:lsdException w:name="List Table 6 Colorful" w:uiPriority="51"/>
-    <w:lsdException w:name="List Table 7 Colorful" w:uiPriority="52"/>
-    <w:lsdException w:name="List Table 1 Light Accent 1" w:uiPriority="46"/>
-    <w:lsdException w:name="List Table 2 Accent 1" w:uiPriority="47"/>
-    <w:lsdException w:name="List Table 3 Accent 1" w:uiPriority="48"/>
-    <w:lsdException w:name="List Table 4 Accent 1" w:uiPriority="49"/>
-    <w:lsdException w:name="List Table 5 Dark Accent 1" w:uiPriority="50"/>
-    <w:lsdException w:name="List Table 6 Colorful Accent 1" w:uiPriority="51"/>
-    <w:lsdException w:name="List Table 7 Colorful Accent 1" w:uiPriority="52"/>
-    <w:lsdException w:name="List Table 1 Light Accent 2" w:uiPriority="46"/>
-    <w:lsdException w:name="List Table 2 Accent 2" w:uiPriority="47"/>
-    <w:lsdException w:name="List Table 3 Accent 2" w:uiPriority="48"/>
-    <w:lsdException w:name="List Table 4 Accent 2" w:uiPriority="49"/>
-    <w:lsdException w:name="List Table 5 Dark Accent 2" w:uiPriority="50"/>
-    <w:lsdException w:name="List Table 6 Colorful Accent 2" w:uiPriority="51"/>
-    <w:lsdException w:name="List Table 7 Colorful Accent 2" w:uiPriority="52"/>
-    <w:lsdException w:name="List Table 1 Light Accent 3" w:uiPriority="46"/>
-    <w:lsdException w:name="List Table 2 Accent 3" w:uiPriority="47"/>
-    <w:lsdException w:name="List Table 3 Accent 3" w:uiPriority="48"/>
-    <w:lsdException w:name="List Table 4 Accent 3" w:uiPriority="49"/>
-    <w:lsdException w:name="List Table 5 Dark Accent 3" w:uiPriority="50"/>
-    <w:lsdException w:name="List Table 6 Colorful Accent 3" w:uiPriority="51"/>
-    <w:lsdException w:name="List Table 7 Colorful Accent 3" w:uiPriority="52"/>
-    <w:lsdException w:name="List Table 1 Light Accent 4" w:uiPriority="46"/>
-    <w:lsdException w:name="List Table 2 Accent 4" w:uiPriority="47"/>
-    <w:lsdException w:name="List Table 3 Accent 4" w:uiPriority="48"/>
-    <w:lsdException w:name="List Table 4 Accent 4" w:uiPriority="49"/>
-    <w:lsdException w:name="List Table 5 Dark Accent 4" w:uiPriority="50"/>
-    <w:lsdException w:name="List Table 6 Colorful Accent 4" w:uiPriority="51"/>
-    <w:lsdException w:name="List Table 7 Colorful Accent 4" w:uiPriority="52"/>
-    <w:lsdException w:name="List Table 1 Light Accent 5" w:uiPriority="46"/>
-    <w:lsdException w:name="List Table 2 Accent 5" w:uiPriority="47"/>
-    <w:lsdException w:name="List Table 3 Accent 5" w:uiPriority="48"/>
-    <w:lsdException w:name="List Table 4 Accent 5" w:uiPriority="49"/>
-    <w:lsdException w:name="List Table 5 Dark Accent 5" w:uiPriority="50"/>
-    <w:lsdException w:name="List Table 6 Colorful Accent 5" w:uiPriority="51"/>
-    <w:lsdException w:name="List Table 7 Colorful Accent 5" w:uiPriority="52"/>
-    <w:lsdException w:name="List Table 1 Light Accent 6" w:uiPriority="46"/>
-    <w:lsdException w:name="List Table 2 Accent 6" w:uiPriority="47"/>
-    <w:lsdException w:name="List Table 3 Accent 6" w:uiPriority="48"/>
-    <w:lsdException w:name="List Table 4 Accent 6" w:uiPriority="49"/>
-    <w:lsdException w:name="List Table 5 Dark Accent 6" w:uiPriority="50"/>
-    <w:lsdException w:name="List Table 6 Colorful Accent 6" w:uiPriority="51"/>
-    <w:lsdException w:name="List Table 7 Colorful Accent 6" w:uiPriority="52"/>
-    <w:lsdException w:name="Mention" w:semiHidden="1" w:unhideWhenUsed="1"/>
-    <w:lsdException w:name="Smart Hyperlink" w:semiHidden="1" w:unhideWhenUsed="1"/>
-    <w:lsdException w:name="Hashtag" w:semiHidden="1" w:unhideWhenUsed="1"/>
-    <w:lsdException w:name="Unresolved Mention" w:semiHidden="1" w:unhideWhenUsed="1"/>
-    <w:lsdException w:name="Smart Link" w:semiHidden="1" w:unhideWhenUsed="1"/>
-  </w:latentStyles>
-  <w:style w:type="paragraph" w:default="1" w:styleId="Normal">
-    <w:name w:val="Normal"/>
-    <w:qFormat/>
-  </w:style>
-  <w:style w:type="character" w:default="1" w:styleId="DefaultParagraphFont">
-    <w:name w:val="Default Paragraph Font"/>
-    <w:uiPriority w:val="1"/>
-    <w:semiHidden/>
-    <w:unhideWhenUsed/>
-  </w:style>
-  <w:style w:type="table" w:default="1" w:styleId="TableNormal">
-    <w:name w:val="Normal Table"/>
-    <w:uiPriority w:val="99"/>
-    <w:semiHidden/>
-    <w:unhideWhenUsed/>
-    <w:tblPr>
-      <w:tblInd w:w="0" w:type="dxa"/>
-      <w:tblCellMar>
-        <w:top w:w="0" w:type="dxa"/>
-        <w:left w:w="108" w:type="dxa"/>
-        <w:bottom w:w="0" w:type="dxa"/>
-        <w:right w:w="108" w:type="dxa"/>
-      </w:tblCellMar>
-    </w:tblPr>
-  </w:style>
-  <w:style w:type="numbering" w:default="1" w:styleId="NoList">
-    <w:name w:val="No List"/>
-    <w:uiPriority w:val="99"/>
-    <w:semiHidden/>
-    <w:unhideWhenUsed/>
-  </w:style>
-  <w:style w:type="character" w:styleId="PlaceholderText">
-    <w:name w:val="Placeholder Text"/>
-    <w:basedOn w:val="DefaultParagraphFont"/>
-    <w:uiPriority w:val="99"/>
-    <w:semiHidden/>
-    <w:rsid w:val="008B19FC"/>
-    <w:rPr>
-      <w:color w:val="808080"/>
-    </w:rPr>
-  </w:style>
-</w:styles>
-</file>
-
-<file path=word/glossary/webSettings.xml><?xml version="1.0" encoding="utf-8"?>
-<w:webSettings xmlns:mc="http://schemas.openxmlformats.org/markup-compatibility/2006" xmlns:r="http://schemas.openxmlformats.org/officeDocument/2006/relationships" xmlns:w="http://schemas.openxmlformats.org/wordprocessingml/2006/main" xmlns:w14="http://schemas.microsoft.com/office/word/2010/wordml" xmlns:w15="http://schemas.microsoft.com/office/word/2012/wordml" xmlns:w16cex="http://schemas.microsoft.com/office/word/2018/wordml/cex" xmlns:w16cid="http://schemas.microsoft.com/office/word/2016/wordml/cid" xmlns:w16="http://schemas.microsoft.com/office/word/2018/wordml" xmlns:w16sdtdh="http://schemas.microsoft.com/office/word/2020/wordml/sdtdatahash" xmlns:w16se="http://schemas.microsoft.com/office/word/2015/wordml/symex" mc:Ignorable="w14 w15 w16se w16cid w16 w16cex w16sdtdh">
-  <w:optimizeForBrowser/>
-  <w:allowPNG/>
-</w:webSettings>
-</file>
-
 <file path=word/theme/theme1.xml><?xml version="1.0" encoding="utf-8"?>
 <a:theme xmlns:a="http://schemas.openxmlformats.org/drawingml/2006/main" name="Office Theme">
   <a:themeElements>

</xml_diff>